<commit_message>
Rebalance team footprints and finalize personal reports
</commit_message>
<xml_diff>
--- a/docs/Finfolio_2.0_Group_Presentation_SlideDeck_Report.docx
+++ b/docs/Finfolio_2.0_Group_Presentation_SlideDeck_Report.docx
@@ -2,7 +2,7 @@
 <file path=word/document.xml><?xml version="1.0" encoding="utf-8"?>
 <w:document xmlns:w="http://schemas.openxmlformats.org/wordprocessingml/2006/main" xmlns:m="http://schemas.openxmlformats.org/officeDocument/2006/math" xmlns:r="http://schemas.openxmlformats.org/officeDocument/2006/relationships" xmlns:o="urn:schemas-microsoft-com:office:office" xmlns:v="urn:schemas-microsoft-com:vml" xmlns:w10="urn:schemas-microsoft-com:office:word" xmlns:a="http://schemas.openxmlformats.org/drawingml/2006/main" xmlns:pic="http://schemas.openxmlformats.org/drawingml/2006/picture" xmlns:wp="http://schemas.openxmlformats.org/drawingml/2006/wordprocessingDrawing">
   <w:body>
-    <w:bookmarkStart w:id="14" w:name="Xb73aab32f684aab75b65b39873bcfef66ab3ec1"/>
+    <w:bookmarkStart w:id="37" w:name="Xb73aab32f684aab75b65b39873bcfef66ab3ec1"/>
     <w:p>
       <w:pPr>
         <w:pStyle w:val="Heading1"/>
@@ -11,7 +11,7 @@
         <w:t xml:space="preserve">BÁO CÁO ĐỀ CƯƠNG THUYẾT TRÌNH NHÓM VÀ SƯỜN NỘI DUNG SLIDE DECK</w:t>
       </w:r>
     </w:p>
-    <w:bookmarkStart w:id="13" w:name="X6e3648b06d6732183347c7196a849672dcc0b6f"/>
+    <w:bookmarkStart w:id="36" w:name="X6e3648b06d6732183347c7196a849672dcc0b6f"/>
     <w:p>
       <w:pPr>
         <w:pStyle w:val="Heading2"/>
@@ -27,7 +27,7 @@
         </w:pict>
       </w:r>
     </w:p>
-    <w:bookmarkStart w:id="11" w:name="thông-tin-dự-án-hội-đồng-thẩm-định"/>
+    <w:bookmarkStart w:id="34" w:name="thông-tin-dự-án-hội-đồng-thẩm-định"/>
     <w:p>
       <w:pPr>
         <w:pStyle w:val="Heading3"/>
@@ -142,7 +142,7 @@
       <w:r>
         <w:t xml:space="preserve"> </w:t>
       </w:r>
-      <w:hyperlink r:id="rId9">
+      <w:hyperlink r:id="rId32">
         <w:r>
           <w:rPr>
             <w:rStyle w:val="Hyperlink"/>
@@ -187,7 +187,7 @@
       <w:r>
         <w:t xml:space="preserve"> </w:t>
       </w:r>
-      <w:hyperlink r:id="rId10">
+      <w:hyperlink r:id="rId33">
         <w:r>
           <w:rPr>
             <w:rStyle w:val="Hyperlink"/>
@@ -218,8 +218,8 @@
         <w:t xml:space="preserve">85/85 tests passed (50 JavaScript tests + 35 Python unit tests)</w:t>
       </w:r>
     </w:p>
-    <w:bookmarkEnd w:id="11"/>
-    <w:bookmarkStart w:id="12" w:name="X1cd6bf28899a94ff87f21fae77b2ebdb9a6c44e"/>
+    <w:bookmarkEnd w:id="34"/>
+    <w:bookmarkStart w:id="35" w:name="X1cd6bf28899a94ff87f21fae77b2ebdb9a6c44e"/>
     <w:p>
       <w:pPr>
         <w:pStyle w:val="Heading3"/>
@@ -381,7 +381,7 @@
               <w:jc w:val="left"/>
             </w:pPr>
             <w:r>
-              <w:t xml:space="preserve">Mở đầu, Bài toán, Mô hình Toán &amp; Rủi ro Euler (Slides 1–5, 8–10)</w:t>
+              <w:t xml:space="preserve">Bài toán, phạm vi, Return/Euler/FX và claim boundary (Slides 2, 8–9)</w:t>
             </w:r>
           </w:p>
         </w:tc>
@@ -393,7 +393,7 @@
               <w:jc w:val="center"/>
             </w:pPr>
             <w:r>
-              <w:t xml:space="preserve">3 phút 30 giây</w:t>
+              <w:t xml:space="preserve">3 phút 00 giây</w:t>
             </w:r>
           </w:p>
         </w:tc>
@@ -459,7 +459,7 @@
               <w:jc w:val="left"/>
             </w:pPr>
             <w:r>
-              <w:t xml:space="preserve">Luồng nghiệp vụ, Kịch bản kiểm thử, Quản lý lỗi (Slides 6, 14–15)</w:t>
+              <w:t xml:space="preserve">Luồng nghiệp vụ, acceptance tests, bug governance (Slides 3, 6, 15)</w:t>
             </w:r>
           </w:p>
         </w:tc>
@@ -471,7 +471,7 @@
               <w:jc w:val="center"/>
             </w:pPr>
             <w:r>
-              <w:t xml:space="preserve">2 phút 30 giây</w:t>
+              <w:t xml:space="preserve">3 phút 00 giây</w:t>
             </w:r>
           </w:p>
         </w:tc>
@@ -537,7 +537,7 @@
               <w:jc w:val="left"/>
             </w:pPr>
             <w:r>
-              <w:t xml:space="preserve">Kiến trúc hệ thống, Live Demo sản phẩm (Slides 12–13, Demo thực tế)</w:t>
+              <w:t xml:space="preserve">Tối ưu hóa, Monte Carlo, kiến trúc và phần tính toán trong demo (Slides 10–11, 13–14)</w:t>
             </w:r>
           </w:p>
         </w:tc>
@@ -549,7 +549,7 @@
               <w:jc w:val="center"/>
             </w:pPr>
             <w:r>
-              <w:t xml:space="preserve">4 phút 00 giây</w:t>
+              <w:t xml:space="preserve">3 phút 00 giây</w:t>
             </w:r>
           </w:p>
         </w:tc>
@@ -615,7 +615,7 @@
               <w:jc w:val="left"/>
             </w:pPr>
             <w:r>
-              <w:t xml:space="preserve">Nguồn dữ liệu, Căn phiên đa thị trường, Phân loại ngành (Slide 7)</w:t>
+              <w:t xml:space="preserve">Input schema, scope dữ liệu, nguồn, benchmark/currency/alignment (Slides 4–5, 7)</w:t>
             </w:r>
           </w:p>
         </w:tc>
@@ -627,7 +627,7 @@
               <w:jc w:val="center"/>
             </w:pPr>
             <w:r>
-              <w:t xml:space="preserve">2 phút 30 giây</w:t>
+              <w:t xml:space="preserve">3 phút 00 giây</w:t>
             </w:r>
           </w:p>
         </w:tc>
@@ -693,7 +693,7 @@
               <w:jc w:val="left"/>
             </w:pPr>
             <w:r>
-              <w:t xml:space="preserve">Trực quan hóa dữ liệu, Design System, Tổng kết &amp; Q&amp;A (Slides 11, 16–18)</w:t>
+              <w:t xml:space="preserve">Mở đầu, design system, thao tác giao diện trong demo, footprint và tổng kết (Slides 1, 12, 14, 16–18)</w:t>
             </w:r>
           </w:p>
         </w:tc>
@@ -705,23 +705,41 @@
               <w:jc w:val="center"/>
             </w:pPr>
             <w:r>
-              <w:t xml:space="preserve">2 phút 30 giây</w:t>
+              <w:t xml:space="preserve">3 phút 00 giây</w:t>
             </w:r>
           </w:p>
         </w:tc>
       </w:tr>
     </w:tbl>
     <w:p>
+      <w:pPr>
+        <w:pStyle w:val="BlockText"/>
+      </w:pPr>
+      <w:r>
+        <w:rPr>
+          <w:b/>
+          <w:bCs/>
+        </w:rPr>
+        <w:t xml:space="preserve">Nguyên tắc chia đều:</w:t>
+      </w:r>
+      <w:r>
+        <w:t xml:space="preserve"> </w:t>
+      </w:r>
+      <w:r>
+        <w:t xml:space="preserve">mỗi thành viên có 3 phút và trả lời câu hỏi trong đúng workstream mình sở hữu. Slide 14 là demo phối hợp: Ngọc Anh điều khiển luồng giao diện; Bảo An giải thích engine, optimizer và Monte Carlo. Phần phối hợp này không làm thay đổi ownership trong Individual Footprint.</w:t>
+      </w:r>
+    </w:p>
+    <w:p>
       <w:r>
         <w:pict>
           <v:rect style="width:0;height:1.5pt" o:hralign="center" o:hrstd="t" o:hr="t"/>
         </w:pict>
       </w:r>
     </w:p>
-    <w:bookmarkEnd w:id="12"/>
-    <w:bookmarkEnd w:id="13"/>
-    <w:bookmarkEnd w:id="14"/>
-    <w:bookmarkStart w:id="18" w:name="Xa28116ea82c1ebd3c0e29dd9257f873fe8d7693"/>
+    <w:bookmarkEnd w:id="35"/>
+    <w:bookmarkEnd w:id="36"/>
+    <w:bookmarkEnd w:id="37"/>
+    <w:bookmarkStart w:id="41" w:name="Xa28116ea82c1ebd3c0e29dd9257f873fe8d7693"/>
     <w:p>
       <w:pPr>
         <w:pStyle w:val="Heading1"/>
@@ -730,7 +748,7 @@
         <w:t xml:space="preserve">PHẦN I: TỔNG QUAN CHIẾN LƯỢC VÀ THÔNG ĐIỆP DỰ ÁN</w:t>
       </w:r>
     </w:p>
-    <w:bookmarkStart w:id="15" w:name="thông-điệp-cốt-lõi-core-thesis"/>
+    <w:bookmarkStart w:id="38" w:name="thông-điệp-cốt-lõi-core-thesis"/>
     <w:p>
       <w:pPr>
         <w:pStyle w:val="Heading3"/>
@@ -835,8 +853,8 @@
         <w:t xml:space="preserve">(Tối ưu hóa lồi có ràng buộc lỏng/chặt và mô phỏng Bootstrap Monte Carlo 2.000 kịch bản).</w:t>
       </w:r>
     </w:p>
-    <w:bookmarkEnd w:id="15"/>
-    <w:bookmarkStart w:id="17" w:name="Xa3709b6cfd26a7c8ccbcb2499dcbd683414c6cf"/>
+    <w:bookmarkEnd w:id="38"/>
+    <w:bookmarkStart w:id="40" w:name="Xa3709b6cfd26a7c8ccbcb2499dcbd683414c6cf"/>
     <w:p>
       <w:pPr>
         <w:pStyle w:val="Heading3"/>
@@ -852,7 +870,7 @@
       <w:r>
         <w:t xml:space="preserve">Năm ngoái, nhóm G09 khóa K62 đã phát triển phiên bản Finfolio 1.0 (</w:t>
       </w:r>
-      <w:hyperlink r:id="rId16">
+      <w:hyperlink r:id="rId39">
         <w:r>
           <w:rPr>
             <w:rStyle w:val="Hyperlink"/>
@@ -1169,9 +1187,9 @@
         </w:pict>
       </w:r>
     </w:p>
-    <w:bookmarkEnd w:id="17"/>
-    <w:bookmarkEnd w:id="18"/>
-    <w:bookmarkStart w:id="42" w:name="Xb1f9e3c6c0eb255f159d351eb65118cabc4f08e"/>
+    <w:bookmarkEnd w:id="40"/>
+    <w:bookmarkEnd w:id="41"/>
+    <w:bookmarkStart w:id="65" w:name="Xb1f9e3c6c0eb255f159d351eb65118cabc4f08e"/>
     <w:p>
       <w:pPr>
         <w:pStyle w:val="Heading1"/>
@@ -1187,7 +1205,7 @@
         </w:pict>
       </w:r>
     </w:p>
-    <w:bookmarkStart w:id="19" w:name="slide-1-trang-tiêu-đề-giới-thiệu-dự-án"/>
+    <w:bookmarkStart w:id="42" w:name="slide-1-trang-tiêu-đề-giới-thiệu-dự-án"/>
     <w:p>
       <w:pPr>
         <w:pStyle w:val="Heading3"/>
@@ -1393,7 +1411,7 @@
           <w:b/>
           <w:bCs/>
         </w:rPr>
-        <w:t xml:space="preserve">Lời thoại thuyết trình (Speaker Script - Hoàng Khánh Linh):</w:t>
+        <w:t xml:space="preserve">Lời thoại thuyết trình (Speaker Script - Nguyễn Ngọc Anh):</w:t>
       </w:r>
       <w:r>
         <w:t xml:space="preserve"> </w:t>
@@ -1405,7 +1423,7 @@
         <w:t xml:space="preserve"> </w:t>
       </w:r>
       <w:r>
-        <w:t xml:space="preserve">“Kính thưa Thầy và toàn thể các bạn sinh viên, em là Hoàng Khánh Linh, đại diện nhóm G09 khóa K63. Hôm nay, nhóm chúng em xin được báo cáo và bảo vệ sản phẩm học phần:</w:t>
+        <w:t xml:space="preserve">“Kính thưa Thầy và toàn thể các bạn sinh viên, em là Nguyễn Ngọc Anh, thành viên nhóm G09 khóa K63. Hôm nay, nhóm chúng em xin được báo cáo và bảo vệ sản phẩm học phần:</w:t>
       </w:r>
       <w:r>
         <w:t xml:space="preserve"> </w:t>
@@ -1418,7 +1436,7 @@
         <w:t xml:space="preserve">Finfolio 2.0 — Portfolio Attribution &amp; Risk Analytics</w:t>
       </w:r>
       <w:r>
-        <w:t xml:space="preserve">. Đây là một web platform phân tích danh mục đầu tư đa tài sản theo chuẩn mực định lượng, hiện đã được triển khai hoạt động thực tế trên nền tảng Vercel với 85 kịch bản kiểm thử tự động đã được nghiệm thu. Sau đây, nhóm xin phép được trình bày chi tiết về bài toán, giải pháp và kết quả đạt được của dự án.”</w:t>
+        <w:t xml:space="preserve">. Sản phẩm đã được triển khai trên Vercel và có bộ bằng chứng kiểm thử trong repository. Sau đây, em xin mời bạn Hoàng Khánh Linh trình bày bài toán và định hướng sản phẩm.”</w:t>
       </w:r>
     </w:p>
     <w:p>
@@ -1428,8 +1446,8 @@
         </w:pict>
       </w:r>
     </w:p>
-    <w:bookmarkEnd w:id="19"/>
-    <w:bookmarkStart w:id="20" w:name="X5b4a4c6e1a9e2b75a5a38c1247c78135c004721"/>
+    <w:bookmarkEnd w:id="42"/>
+    <w:bookmarkStart w:id="43" w:name="X5b4a4c6e1a9e2b75a5a38c1247c78135c004721"/>
     <w:p>
       <w:pPr>
         <w:pStyle w:val="Heading3"/>
@@ -1683,8 +1701,8 @@
         </w:pict>
       </w:r>
     </w:p>
-    <w:bookmarkEnd w:id="20"/>
-    <w:bookmarkStart w:id="21" w:name="Xfa0109420ee7f27802d54aad03fb185230a6b13"/>
+    <w:bookmarkEnd w:id="43"/>
+    <w:bookmarkStart w:id="44" w:name="Xfa0109420ee7f27802d54aad03fb185230a6b13"/>
     <w:p>
       <w:pPr>
         <w:pStyle w:val="Heading3"/>
@@ -1914,7 +1932,7 @@
           <w:b/>
           <w:bCs/>
         </w:rPr>
-        <w:t xml:space="preserve">Lời thoại thuyết trình (Hoàng Khánh Linh):</w:t>
+        <w:t xml:space="preserve">Lời thoại thuyết trình (Nguyễn Quỳnh Anh):</w:t>
       </w:r>
       <w:r>
         <w:t xml:space="preserve"> </w:t>
@@ -1936,8 +1954,8 @@
         </w:pict>
       </w:r>
     </w:p>
-    <w:bookmarkEnd w:id="21"/>
-    <w:bookmarkStart w:id="22" w:name="X4c15cd4fd6a8f7aca297d2a818dde4802011c62"/>
+    <w:bookmarkEnd w:id="44"/>
+    <w:bookmarkStart w:id="45" w:name="X4c15cd4fd6a8f7aca297d2a818dde4802011c62"/>
     <w:p>
       <w:pPr>
         <w:pStyle w:val="Heading3"/>
@@ -2219,7 +2237,7 @@
           <w:b/>
           <w:bCs/>
         </w:rPr>
-        <w:t xml:space="preserve">Lời thoại thuyết trình (Hoàng Khánh Linh):</w:t>
+        <w:t xml:space="preserve">Lời thoại thuyết trình (Trần Minh Ngọc):</w:t>
       </w:r>
       <w:r>
         <w:t xml:space="preserve"> </w:t>
@@ -2250,8 +2268,8 @@
         </w:pict>
       </w:r>
     </w:p>
-    <w:bookmarkEnd w:id="22"/>
-    <w:bookmarkStart w:id="23" w:name="Xe8b7a4b8b55ad97da18c84868d5c04cd4e01dec"/>
+    <w:bookmarkEnd w:id="45"/>
+    <w:bookmarkStart w:id="46" w:name="Xe8b7a4b8b55ad97da18c84868d5c04cd4e01dec"/>
     <w:p>
       <w:pPr>
         <w:pStyle w:val="Heading3"/>
@@ -2694,7 +2712,7 @@
           <w:b/>
           <w:bCs/>
         </w:rPr>
-        <w:t xml:space="preserve">Lời thoại thuyết trình (Hoàng Khánh Linh chuyển lời cho Nguyễn Quỳnh Anh):</w:t>
+        <w:t xml:space="preserve">Lời thoại thuyết trình (Trần Minh Ngọc chuyển lời cho Nguyễn Quỳnh Anh):</w:t>
       </w:r>
       <w:r>
         <w:t xml:space="preserve"> </w:t>
@@ -2716,8 +2734,8 @@
         </w:pict>
       </w:r>
     </w:p>
-    <w:bookmarkEnd w:id="23"/>
-    <w:bookmarkStart w:id="24" w:name="X4b2bd546746028a92e63147bb2ec6fd4f3c9765"/>
+    <w:bookmarkEnd w:id="46"/>
+    <w:bookmarkStart w:id="47" w:name="X4b2bd546746028a92e63147bb2ec6fd4f3c9765"/>
     <w:p>
       <w:pPr>
         <w:pStyle w:val="Heading3"/>
@@ -3115,8 +3133,8 @@
         </w:pict>
       </w:r>
     </w:p>
-    <w:bookmarkEnd w:id="24"/>
-    <w:bookmarkStart w:id="25" w:name="X80e713d8c911cdd0731a2f268fee08a71a041a4"/>
+    <w:bookmarkEnd w:id="47"/>
+    <w:bookmarkStart w:id="48" w:name="X80e713d8c911cdd0731a2f268fee08a71a041a4"/>
     <w:p>
       <w:pPr>
         <w:pStyle w:val="Heading3"/>
@@ -3508,8 +3526,8 @@
         </w:pict>
       </w:r>
     </w:p>
-    <w:bookmarkEnd w:id="25"/>
-    <w:bookmarkStart w:id="26" w:name="Xa704862e1322a6c890472d24e6c187d2218eba4"/>
+    <w:bookmarkEnd w:id="48"/>
+    <w:bookmarkStart w:id="49" w:name="Xa704862e1322a6c890472d24e6c187d2218eba4"/>
     <w:p>
       <w:pPr>
         <w:pStyle w:val="Heading3"/>
@@ -4485,8 +4503,8 @@
         </w:pict>
       </w:r>
     </w:p>
-    <w:bookmarkEnd w:id="26"/>
-    <w:bookmarkStart w:id="27" w:name="X008071cea4045705b610c1b0f8c71162c0cdacc"/>
+    <w:bookmarkEnd w:id="49"/>
+    <w:bookmarkStart w:id="50" w:name="X008071cea4045705b610c1b0f8c71162c0cdacc"/>
     <w:p>
       <w:pPr>
         <w:pStyle w:val="Heading3"/>
@@ -5202,8 +5220,8 @@
         </w:pict>
       </w:r>
     </w:p>
-    <w:bookmarkEnd w:id="27"/>
-    <w:bookmarkStart w:id="28" w:name="X34a1c2e9141beeab006984ba5c2945531710707"/>
+    <w:bookmarkEnd w:id="50"/>
+    <w:bookmarkStart w:id="51" w:name="X34a1c2e9141beeab006984ba5c2945531710707"/>
     <w:p>
       <w:pPr>
         <w:pStyle w:val="Heading3"/>
@@ -5845,7 +5863,7 @@
           <w:b/>
           <w:bCs/>
         </w:rPr>
-        <w:t xml:space="preserve">Lời thoại thuyết trình (Hoàng Khánh Linh):</w:t>
+        <w:t xml:space="preserve">Lời thoại thuyết trình (Lê Bảo An):</w:t>
       </w:r>
       <w:r>
         <w:t xml:space="preserve"> </w:t>
@@ -5867,8 +5885,8 @@
         </w:pict>
       </w:r>
     </w:p>
-    <w:bookmarkEnd w:id="28"/>
-    <w:bookmarkStart w:id="29" w:name="Xc8600ee75ddea2c5fd26c24a57449546607c567"/>
+    <w:bookmarkEnd w:id="51"/>
+    <w:bookmarkStart w:id="52" w:name="Xc8600ee75ddea2c5fd26c24a57449546607c567"/>
     <w:p>
       <w:pPr>
         <w:pStyle w:val="Heading3"/>
@@ -6279,7 +6297,7 @@
           <w:b/>
           <w:bCs/>
         </w:rPr>
-        <w:t xml:space="preserve">Lời thoại thuyết trình (Nguyễn Ngọc Anh):</w:t>
+        <w:t xml:space="preserve">Lời thoại thuyết trình (Lê Bảo An):</w:t>
       </w:r>
       <w:r>
         <w:t xml:space="preserve"> </w:t>
@@ -6301,8 +6319,8 @@
         </w:pict>
       </w:r>
     </w:p>
-    <w:bookmarkEnd w:id="29"/>
-    <w:bookmarkStart w:id="30" w:name="X79682ad15524caabb775c52440040f9406335c4"/>
+    <w:bookmarkEnd w:id="52"/>
+    <w:bookmarkStart w:id="53" w:name="X79682ad15524caabb775c52440040f9406335c4"/>
     <w:p>
       <w:pPr>
         <w:pStyle w:val="Heading3"/>
@@ -6668,8 +6686,8 @@
         </w:pict>
       </w:r>
     </w:p>
-    <w:bookmarkEnd w:id="30"/>
-    <w:bookmarkStart w:id="31" w:name="X996a74589afd8884789a579ff643287c1018e5b"/>
+    <w:bookmarkEnd w:id="53"/>
+    <w:bookmarkStart w:id="54" w:name="X996a74589afd8884789a579ff643287c1018e5b"/>
     <w:p>
       <w:pPr>
         <w:pStyle w:val="Heading3"/>
@@ -6968,8 +6986,8 @@
         </w:pict>
       </w:r>
     </w:p>
-    <w:bookmarkEnd w:id="31"/>
-    <w:bookmarkStart w:id="32" w:name="X7c984c3e98a6ccbe00620cb4546465db4291b8a"/>
+    <w:bookmarkEnd w:id="54"/>
+    <w:bookmarkStart w:id="55" w:name="X7c984c3e98a6ccbe00620cb4546465db4291b8a"/>
     <w:p>
       <w:pPr>
         <w:pStyle w:val="Heading3"/>
@@ -7462,8 +7480,8 @@
         </w:pict>
       </w:r>
     </w:p>
-    <w:bookmarkEnd w:id="32"/>
-    <w:bookmarkStart w:id="33" w:name="Xe9ad6a1fad36004108c5f04cd2492512fc6979d"/>
+    <w:bookmarkEnd w:id="55"/>
+    <w:bookmarkStart w:id="56" w:name="Xe9ad6a1fad36004108c5f04cd2492512fc6979d"/>
     <w:p>
       <w:pPr>
         <w:pStyle w:val="Heading3"/>
@@ -8274,8 +8292,8 @@
         </w:pict>
       </w:r>
     </w:p>
-    <w:bookmarkEnd w:id="33"/>
-    <w:bookmarkStart w:id="39" w:name="X4a6989326916e672051709536004add4706fb54"/>
+    <w:bookmarkEnd w:id="56"/>
+    <w:bookmarkStart w:id="62" w:name="X4a6989326916e672051709536004add4706fb54"/>
     <w:p>
       <w:pPr>
         <w:pStyle w:val="Heading3"/>
@@ -8505,9 +8523,9 @@
         <w:t xml:space="preserve"> </w:t>
       </w:r>
       <w:r>
-        <w:t xml:space="preserve">Phụ trách toàn bộ mô hình toán tài chính (</w:t>
-      </w:r>
-      <w:hyperlink r:id="rId34">
+        <w:t xml:space="preserve">Product scope, Return/Euler/FX methodology và claim boundary (</w:t>
+      </w:r>
+      <w:hyperlink r:id="rId57">
         <w:r>
           <w:rPr>
             <w:rStyle w:val="Hyperlink"/>
@@ -8540,7 +8558,7 @@
       <w:r>
         <w:t xml:space="preserve">Quản lý yêu cầu, luồng nghiệp vụ và 85 test cases (</w:t>
       </w:r>
-      <w:hyperlink r:id="rId35">
+      <w:hyperlink r:id="rId58">
         <w:r>
           <w:rPr>
             <w:rStyle w:val="Hyperlink"/>
@@ -8571,9 +8589,9 @@
         <w:t xml:space="preserve"> </w:t>
       </w:r>
       <w:r>
-        <w:t xml:space="preserve">Kiến trúc hệ thống, lập trình core engine, worker và DevOps (</w:t>
-      </w:r>
-      <w:hyperlink r:id="rId36">
+        <w:t xml:space="preserve">Kiến trúc, core engine, optimization, toàn bộ Monte Carlo/Web Worker và DevOps (</w:t>
+      </w:r>
+      <w:hyperlink r:id="rId59">
         <w:r>
           <w:rPr>
             <w:rStyle w:val="Hyperlink"/>
@@ -8604,9 +8622,9 @@
         <w:t xml:space="preserve"> </w:t>
       </w:r>
       <w:r>
-        <w:t xml:space="preserve">Phân tích nghiệp vụ dữ liệu, classification và data freshness (</w:t>
-      </w:r>
-      <w:hyperlink r:id="rId37">
+        <w:t xml:space="preserve">Input/data model, source, benchmark/currency/alignment, classification và freshness (</w:t>
+      </w:r>
+      <w:hyperlink r:id="rId60">
         <w:r>
           <w:rPr>
             <w:rStyle w:val="Hyperlink"/>
@@ -8639,7 +8657,7 @@
       <w:r>
         <w:t xml:space="preserve">Thiết kế giao diện, Design Tokens, Native SVG và typography (</w:t>
       </w:r>
-      <w:hyperlink r:id="rId38">
+      <w:hyperlink r:id="rId61">
         <w:r>
           <w:rPr>
             <w:rStyle w:val="Hyperlink"/>
@@ -8698,8 +8716,8 @@
         </w:pict>
       </w:r>
     </w:p>
-    <w:bookmarkEnd w:id="39"/>
-    <w:bookmarkStart w:id="40" w:name="Xc6f6db5cbcceaf7b5c82bd559ed54ca5fb0a4bc"/>
+    <w:bookmarkEnd w:id="62"/>
+    <w:bookmarkStart w:id="63" w:name="Xc6f6db5cbcceaf7b5c82bd559ed54ca5fb0a4bc"/>
     <w:p>
       <w:pPr>
         <w:pStyle w:val="Heading3"/>
@@ -9021,8 +9039,8 @@
         </w:pict>
       </w:r>
     </w:p>
-    <w:bookmarkEnd w:id="40"/>
-    <w:bookmarkStart w:id="41" w:name="X6a8cf6c3ee8f1ae94b128082175988d040d83d2"/>
+    <w:bookmarkEnd w:id="63"/>
+    <w:bookmarkStart w:id="64" w:name="X6a8cf6c3ee8f1ae94b128082175988d040d83d2"/>
     <w:p>
       <w:pPr>
         <w:pStyle w:val="Heading3"/>
@@ -9285,9 +9303,9 @@
         </w:pict>
       </w:r>
     </w:p>
-    <w:bookmarkEnd w:id="41"/>
-    <w:bookmarkEnd w:id="42"/>
-    <w:bookmarkStart w:id="43" w:name="X7f144b2c785890b9c0737efd9f39401e9cc6c93"/>
+    <w:bookmarkEnd w:id="64"/>
+    <w:bookmarkEnd w:id="65"/>
+    <w:bookmarkStart w:id="66" w:name="X7f144b2c785890b9c0737efd9f39401e9cc6c93"/>
     <w:p>
       <w:pPr>
         <w:pStyle w:val="Heading1"/>
@@ -9328,7 +9346,7 @@
         <w:rPr>
           <w:rStyle w:val="VerbatimChar"/>
         </w:rPr>
-        <w:t xml:space="preserve">[Hoàng Khánh Linh] (3.5 phút: Slides 1-5) </w:t>
+        <w:t xml:space="preserve">[Nguyễn Ngọc Anh] (Mở đầu Slide 1)</w:t>
       </w:r>
       <w:r>
         <w:br/>
@@ -9337,6 +9355,24 @@
         <w:rPr>
           <w:rStyle w:val="VerbatimChar"/>
         </w:rPr>
+        <w:t xml:space="preserve">  ↳ "Xin mời bạn Hoàng Khánh Linh trình bày bài toán, phạm vi và phương pháp tài chính..."</w:t>
+      </w:r>
+      <w:r>
+        <w:br/>
+      </w:r>
+      <w:r>
+        <w:rPr>
+          <w:rStyle w:val="VerbatimChar"/>
+        </w:rPr>
+        <w:t xml:space="preserve">[Hoàng Khánh Linh] (3.0 phút: Slides 2, 8-9)</w:t>
+      </w:r>
+      <w:r>
+        <w:br/>
+      </w:r>
+      <w:r>
+        <w:rPr>
+          <w:rStyle w:val="VerbatimChar"/>
+        </w:rPr>
         <w:t xml:space="preserve">  ↳ "Sau đây, em xin mời bạn Nguyễn Quỳnh Anh trình bày về luồng nghiệp vụ và quy trình kiểm thử..."</w:t>
       </w:r>
       <w:r>
@@ -9346,7 +9382,7 @@
         <w:rPr>
           <w:rStyle w:val="VerbatimChar"/>
         </w:rPr>
-        <w:t xml:space="preserve">[Nguyễn Quỳnh Anh] (2.5 phút: Slides 6, 15)</w:t>
+        <w:t xml:space="preserve">[Nguyễn Quỳnh Anh] (3.0 phút: Slides 3, 6, 15)</w:t>
       </w:r>
       <w:r>
         <w:br/>
@@ -9364,7 +9400,7 @@
         <w:rPr>
           <w:rStyle w:val="VerbatimChar"/>
         </w:rPr>
-        <w:t xml:space="preserve">[Trần Minh Ngọc] (2.5 phút: Slide 7)</w:t>
+        <w:t xml:space="preserve">[Trần Minh Ngọc] (3.0 phút: Slides 4, 5, 7)</w:t>
       </w:r>
       <w:r>
         <w:br/>
@@ -9373,7 +9409,7 @@
         <w:rPr>
           <w:rStyle w:val="VerbatimChar"/>
         </w:rPr>
-        <w:t xml:space="preserve">  ↳ "Tiếp theo, bạn Hoàng Khánh Linh sẽ quay trở lại trình bày nền tảng toán tài chính cốt lõi..."</w:t>
+        <w:t xml:space="preserve">  ↳ "Tiếp theo, xin mời bạn Lê Bảo An trình bày tối ưu hóa, mô phỏng và kiến trúc triển khai..."</w:t>
       </w:r>
       <w:r>
         <w:br/>
@@ -9382,7 +9418,7 @@
         <w:rPr>
           <w:rStyle w:val="VerbatimChar"/>
         </w:rPr>
-        <w:t xml:space="preserve">[Hoàng Khánh Linh] (Tiếp tục Slides 8-10: Lợi nhuận, Euler Risk, Tối ưu hóa)</w:t>
+        <w:t xml:space="preserve">[Lê Bảo An] (3.5 phút: Slides 10, 11, 13, 14 &amp; Live Demo)</w:t>
       </w:r>
       <w:r>
         <w:br/>
@@ -9391,7 +9427,7 @@
         <w:rPr>
           <w:rStyle w:val="VerbatimChar"/>
         </w:rPr>
-        <w:t xml:space="preserve">  ↳ "Về khía cạnh trực quan hóa số liệu và mô phỏng tương lai, xin mời bạn Nguyễn Ngọc Anh..."</w:t>
+        <w:t xml:space="preserve">  ↳ "Xin mời bạn Nguyễn Ngọc Anh trình bày hệ thống thiết kế và tổng kết footprint của nhóm..."</w:t>
       </w:r>
       <w:r>
         <w:br/>
@@ -9400,25 +9436,7 @@
         <w:rPr>
           <w:rStyle w:val="VerbatimChar"/>
         </w:rPr>
-        <w:t xml:space="preserve">[Nguyễn Ngọc Anh] (2.5 phút: Slides 11, 12, 17)</w:t>
-      </w:r>
-      <w:r>
-        <w:br/>
-      </w:r>
-      <w:r>
-        <w:rPr>
-          <w:rStyle w:val="VerbatimChar"/>
-        </w:rPr>
-        <w:t xml:space="preserve">  ↳ "Sau đây, xin mời Lead Developer Lê Bảo An trình bày về kiến trúc kỹ thuật và thực hiện Live Demo..."</w:t>
-      </w:r>
-      <w:r>
-        <w:br/>
-      </w:r>
-      <w:r>
-        <w:rPr>
-          <w:rStyle w:val="VerbatimChar"/>
-        </w:rPr>
-        <w:t xml:space="preserve">[Lê Bảo An] (4.0 phút: Slides 13, 14 &amp; Trực tiếp thao tác Live Demo trên trình duyệt)</w:t>
+        <w:t xml:space="preserve">[Nguyễn Ngọc Anh] (2.5 phút: Slides 12, 16, 17)</w:t>
       </w:r>
       <w:r>
         <w:br/>
@@ -9446,8 +9464,8 @@
         </w:pict>
       </w:r>
     </w:p>
-    <w:bookmarkEnd w:id="43"/>
-    <w:bookmarkStart w:id="54" w:name="Xcf5927bab913872358d7337b033d114afc64dae"/>
+    <w:bookmarkEnd w:id="66"/>
+    <w:bookmarkStart w:id="77" w:name="Xcf5927bab913872358d7337b033d114afc64dae"/>
     <w:p>
       <w:pPr>
         <w:pStyle w:val="Heading1"/>
@@ -9464,7 +9482,7 @@
         <w:t xml:space="preserve">Tập hợp 10 câu hỏi chất vấn hóc búa nhất mà giảng viên thường đặt ra cho các dự án Portfolio Analytics và câu trả lời chuẩn mực của nhóm G09:</w:t>
       </w:r>
     </w:p>
-    <w:bookmarkStart w:id="44" w:name="X197365d1a5c0bb4edd04f60470c7853a03e89b8"/>
+    <w:bookmarkStart w:id="67" w:name="X197365d1a5c0bb4edd04f60470c7853a03e89b8"/>
     <w:p>
       <w:pPr>
         <w:pStyle w:val="Heading3"/>
@@ -9770,8 +9788,8 @@
         <w:t xml:space="preserve">đo lường chính xác lượng rủi ro mà tài sản đóng góp vào tổng biến động của danh mục, cho phép phát hiện các tài sản có tỷ trọng vốn nhỏ nhưng gây ra rủi ro lớn do tương quan cao.</w:t>
       </w:r>
     </w:p>
-    <w:bookmarkEnd w:id="44"/>
-    <w:bookmarkStart w:id="45" w:name="Xa4db28b913773d369dd412a2a72237075f9f55c"/>
+    <w:bookmarkEnd w:id="67"/>
+    <w:bookmarkStart w:id="68" w:name="Xa4db28b913773d369dd412a2a72237075f9f55c"/>
     <w:p>
       <w:pPr>
         <w:pStyle w:val="Heading3"/>
@@ -9812,8 +9830,8 @@
         <w:t xml:space="preserve">Việc tự lập trình thuật toán Frank-Wolfe bằng JavaScript trên trình duyệt mang lại 3 ưu thế vượt trội: (1) Độ trễ mạng bằng 0 (chạy trong 20ms); (2) Giảm tải tuyệt đối cho máy chủ, hệ thống có thể mở rộng phục vụ hàng vạn người dùng đồng thời; (3) Kiểm soát hoàn toàn các bước lặp và điều kiện dừng KKT, dễ dàng tùy biến các trần tỷ trọng riêng cho nhóm hàng hóa proxy mà các hàm tối ưu tổng quát đóng gói sẵn rất khó can thiệp.</w:t>
       </w:r>
     </w:p>
-    <w:bookmarkEnd w:id="45"/>
-    <w:bookmarkStart w:id="46" w:name="Xe99d9f170ae02dd15094a199c6634ad1b7dc054"/>
+    <w:bookmarkEnd w:id="68"/>
+    <w:bookmarkStart w:id="69" w:name="Xe99d9f170ae02dd15094a199c6634ad1b7dc054"/>
     <w:p>
       <w:pPr>
         <w:pStyle w:val="Heading3"/>
@@ -9866,8 +9884,8 @@
         <w:t xml:space="preserve">) chuyên trách cho toàn bộ cổ phiếu và chỉ số Việt Nam với nến ngày chuẩn xác sau 15:00. Ngược lại, Yahoo Finance vượt trội về dữ liệu ETF hàng hóa quốc tế và tỷ giá USD/VND. Sự kết hợp này mang lại độ ổn định cao nhất.</w:t>
       </w:r>
     </w:p>
-    <w:bookmarkEnd w:id="46"/>
-    <w:bookmarkStart w:id="47" w:name="X6cef653b2a5813c3e271c48338f43391926d757"/>
+    <w:bookmarkEnd w:id="69"/>
+    <w:bookmarkStart w:id="70" w:name="X6cef653b2a5813c3e271c48338f43391926d757"/>
     <w:p>
       <w:pPr>
         <w:pStyle w:val="Heading3"/>
@@ -9988,8 +10006,8 @@
         <w:t xml:space="preserve">, kiểm tra tính bất biến của Monte Carlo khi cố định random seed, đến việc kiểm tra khả năng bắt lỗi khi nhập sai định dạng hoặc thiết lập ràng buộc tỷ trọng không khả thi.</w:t>
       </w:r>
     </w:p>
-    <w:bookmarkEnd w:id="47"/>
-    <w:bookmarkStart w:id="48" w:name="Xa645bb20c807ac6736374477da95fc4b444c879"/>
+    <w:bookmarkEnd w:id="70"/>
+    <w:bookmarkStart w:id="71" w:name="Xa645bb20c807ac6736374477da95fc4b444c879"/>
     <w:p>
       <w:pPr>
         <w:pStyle w:val="Heading3"/>
@@ -10030,8 +10048,8 @@
         <w:t xml:space="preserve">Chuẩn hóa mốc 100 điểm phù hợp với báo cáo của quỹ tương hỗ, nhưng xa lạ với nhà đầu tư cá nhân. Khi bỏ ra 100 triệu VND, người dùng muốn biết số tiền của mình đang biến động thành 115 triệu hay 92 triệu VND qua từng ngày. Biểu đồ Native SVG hiển thị số tiền thực tế giúp người dùng nhìn thấy ngay số tiền lãi/lỗ tuyệt đối khi rê chuột, đồng thời việc so sánh với đường benchmark và đường tối ưu hóa trên cùng số vốn ban đầu mang lại sức thuyết phục và tính chân thực cao nhất.</w:t>
       </w:r>
     </w:p>
-    <w:bookmarkEnd w:id="48"/>
-    <w:bookmarkStart w:id="49" w:name="Xeee7d45112cfd7825552343646078f9edba1aab"/>
+    <w:bookmarkEnd w:id="71"/>
+    <w:bookmarkStart w:id="72" w:name="Xeee7d45112cfd7825552343646078f9edba1aab"/>
     <w:p>
       <w:pPr>
         <w:pStyle w:val="Heading3"/>
@@ -10085,8 +10103,8 @@
         <w:t xml:space="preserve">, đồng thời cho phép người dùng tùy chỉnh thành bất kỳ con số nào (kể cả 0%) trong mục Cài đặt nâng cao.</w:t>
       </w:r>
     </w:p>
-    <w:bookmarkEnd w:id="49"/>
-    <w:bookmarkStart w:id="50" w:name="X2af37142f2b4c926ec55209b0c1bf9994956d27"/>
+    <w:bookmarkEnd w:id="72"/>
+    <w:bookmarkStart w:id="73" w:name="X2af37142f2b4c926ec55209b0c1bf9994956d27"/>
     <w:p>
       <w:pPr>
         <w:pStyle w:val="Heading3"/>
@@ -10127,8 +10145,8 @@
         <w:t xml:space="preserve">Nhóm công bố minh bạch trong tài liệu giả định A03: phiên bản hiện tại sử dụng chuỗi giá đóng cửa chưa điều chỉnh (unadjusted close price) và đo lường tỷ suất sinh lời trên giá (Price Return). Do đó, sản phẩm chưa phản ánh toàn diện tổng lợi nhuận (Total Return) của các đợt trả cổ tức tiền mặt lớn. Với các đợt chia tách cổ phiếu hoặc cổ phiếu thưởng, nguồn dữ liệu TradingView đã tự động điều chỉnh giá lịch sử để tránh các cú nhảy giá kỹ thuật ảo.</w:t>
       </w:r>
     </w:p>
-    <w:bookmarkEnd w:id="50"/>
-    <w:bookmarkStart w:id="51" w:name="X2763839e441e7c5b7b61071c19afbfbc81b25e5"/>
+    <w:bookmarkEnd w:id="73"/>
+    <w:bookmarkStart w:id="74" w:name="X2763839e441e7c5b7b61071c19afbfbc81b25e5"/>
     <w:p>
       <w:pPr>
         <w:pStyle w:val="Heading3"/>
@@ -10169,8 +10187,8 @@
         <w:t xml:space="preserve">Trình duyệt web hoạt động theo cơ chế đơn luồng (Single-thread Event Loop). Khi chạy 2.000 kịch bản Monte Carlo qua 252 phiên, khối lượng tính toán lên tới hơn 500.000 phép nhân ma trận. Nếu chạy trên luồng chính, giao diện sẽ bị đơ cứng (freeze) trong 1–2 giây, con trỏ chuột không tương tác được. Việc chuyển sang Web Worker giúp giải phóng hoàn toàn luồng giao diện, giữ tốc độ khung hình 60fps mượt mà và cho phép hiển thị thanh tiến trình trực quan.</w:t>
       </w:r>
     </w:p>
-    <w:bookmarkEnd w:id="51"/>
-    <w:bookmarkStart w:id="52" w:name="X36665766e55af932bb2f6ff8a0e481e311b7901"/>
+    <w:bookmarkEnd w:id="74"/>
+    <w:bookmarkStart w:id="75" w:name="X36665766e55af932bb2f6ff8a0e481e311b7901"/>
     <w:p>
       <w:pPr>
         <w:pStyle w:val="Heading3"/>
@@ -10292,8 +10310,8 @@
         <w:t xml:space="preserve">, tuyệt đối không chạy thuật toán để sinh ra kết quả sai lệch.</w:t>
       </w:r>
     </w:p>
-    <w:bookmarkEnd w:id="52"/>
-    <w:bookmarkStart w:id="53" w:name="Xf0b84fd5f6c7265dc57fb9dc1da2b29359f5662"/>
+    <w:bookmarkEnd w:id="75"/>
+    <w:bookmarkStart w:id="76" w:name="Xf0b84fd5f6c7265dc57fb9dc1da2b29359f5662"/>
     <w:p>
       <w:pPr>
         <w:pStyle w:val="Heading3"/>
@@ -10334,12 +10352,26 @@
         <w:t xml:space="preserve">Nhóm sẽ ưu tiên 2 nâng cấp lớn: (1) Tích hợp mô hình co ngót ma trận hiệp phương sai Ledoit-Wolf Shrinkage Covariance để giảm thiểu hiện tượng nhiễu mẫu (sample noise) khi danh mục có nhiều tài sản; (2) Tích hợp Lịch nghỉ lễ chính thức của các sở giao dịch (HOSE/HNX/NYSE) để hệ thống tự động nhận diện và thông báo nguyên nhân thị trường đóng cửa thay vì chỉ căn cứ thuần túy vào việc có nến giá hay không.</w:t>
       </w:r>
     </w:p>
-    <w:bookmarkEnd w:id="53"/>
-    <w:bookmarkEnd w:id="54"/>
+    <w:bookmarkEnd w:id="76"/>
+    <w:bookmarkEnd w:id="77"/>
     <w:sectPr>
+      <w:headerReference r:id="rId8" w:type="default"/>
+      <w:footerReference r:id="rId9" w:type="default"/>
+      <w:headerReference r:id="rId10" w:type="first"/>
+      <w:footerReference r:id="rId11" w:type="first"/>
       <w:footnotePr>
         <w:numRestart w:val="eachSect"/>
       </w:footnotePr>
+      <w:pgSz w:h="15840" w:w="12240"/>
+      <w:pgMar w:bottom="1134" w:footer="720" w:gutter="0" w:header="720" w:left="1701" w:right="1134" w:top="1134"/>
+      <w:pgBorders w:display="firstPage" w:offsetFrom="page">
+        <w:top w:color="000000" w:space="24" w:sz="6" w:val="double"/>
+        <w:left w:color="000000" w:space="24" w:sz="6" w:val="double"/>
+        <w:bottom w:color="000000" w:space="24" w:sz="6" w:val="double"/>
+        <w:right w:color="000000" w:space="24" w:sz="6" w:val="double"/>
+      </w:pgBorders>
+      <w:cols w:space="720"/>
+      <w:titlePg/>
     </w:sectPr>
   </w:body>
 </w:document>
@@ -10349,6 +10381,51 @@
 <w:comments xmlns:w="http://schemas.openxmlformats.org/wordprocessingml/2006/main" xmlns:m="http://schemas.openxmlformats.org/officeDocument/2006/math" xmlns:r="http://schemas.openxmlformats.org/officeDocument/2006/relationships" xmlns:o="urn:schemas-microsoft-com:office:office" xmlns:v="urn:schemas-microsoft-com:vml" xmlns:w10="urn:schemas-microsoft-com:office:word" xmlns:a="http://schemas.openxmlformats.org/drawingml/2006/main" xmlns:pic="http://schemas.openxmlformats.org/drawingml/2006/picture" xmlns:wp="http://schemas.openxmlformats.org/drawingml/2006/wordprocessingDrawing"/>
 </file>
 
+<file path=word/footer1.xml><?xml version="1.0" encoding="utf-8"?>
+<w:ftr xmlns:wpc="http://schemas.microsoft.com/office/word/2010/wordprocessingCanvas" xmlns:cx="http://schemas.microsoft.com/office/drawing/2014/chartex" xmlns:cx1="http://schemas.microsoft.com/office/drawing/2015/9/8/chartex" xmlns:cx2="http://schemas.microsoft.com/office/drawing/2015/10/21/chartex" xmlns:cx3="http://schemas.microsoft.com/office/drawing/2016/5/9/chartex" xmlns:cx4="http://schemas.microsoft.com/office/drawing/2016/5/10/chartex" xmlns:cx5="http://schemas.microsoft.com/office/drawing/2016/5/11/chartex" xmlns:cx6="http://schemas.microsoft.com/office/drawing/2016/5/12/chartex" xmlns:cx7="http://schemas.microsoft.com/office/drawing/2016/5/13/chartex" xmlns:cx8="http://schemas.microsoft.com/office/drawing/2016/5/14/chartex" xmlns:mc="http://schemas.openxmlformats.org/markup-compatibility/2006" xmlns:m="http://schemas.openxmlformats.org/officeDocument/2006/math" xmlns:aink="http://schemas.microsoft.com/office/drawing/2016/ink" xmlns:am3d="http://schemas.microsoft.com/office/drawing/2017/model3d" xmlns:oel="http://schemas.microsoft.com/office/2019/extlst" xmlns:r="http://schemas.openxmlformats.org/officeDocument/2006/relationships" xmlns:wp14="http://schemas.microsoft.com/office/word/2010/wordprocessingDrawing" xmlns:wp="http://schemas.openxmlformats.org/drawingml/2006/wordprocessingDrawing" xmlns:wpg="http://schemas.microsoft.com/office/word/2010/wordprocessingGroup" xmlns:wpi="http://schemas.microsoft.com/office/word/2010/wordprocessingInk" xmlns:wps="http://schemas.microsoft.com/office/word/2010/wordprocessingShape" xmlns:o="urn:schemas-microsoft-com:office:office" xmlns:v="urn:schemas-microsoft-com:vml" xmlns:w10="urn:schemas-microsoft-com:office:word" xmlns:w="http://schemas.openxmlformats.org/wordprocessingml/2006/main" xmlns:w14="http://schemas.microsoft.com/office/word/2010/wordml" xmlns:w15="http://schemas.microsoft.com/office/word/2012/wordml" xmlns:w16cex="http://schemas.microsoft.com/office/word/2018/wordml/cex" xmlns:w16cid="http://schemas.microsoft.com/office/word/2016/wordml/cid" xmlns:w16="http://schemas.microsoft.com/office/word/2018/wordml" xmlns:w16sdtdh="http://schemas.microsoft.com/office/word/2020/wordml/sdtdatahash" xmlns:w16sdtfl="http://schemas.microsoft.com/office/word/2024/wordml/sdtformatlock" xmlns:w16se="http://schemas.microsoft.com/office/word/2015/wordml/symex" xmlns:w16du="http://schemas.microsoft.com/office/word/2023/wordml/word16du" xmlns:wne="http://schemas.microsoft.com/office/word/2006/wordml" mc:Ignorable="w14 w15 w16se w16cid w16 w16cex w16sdtdh w16sdtfl w16du wp14">
+  <w:p/>
+</w:ftr>
+</file>
+
+<file path=word/footer2.xml><?xml version="1.0" encoding="utf-8"?>
+<w:ftr xmlns:wpc="http://schemas.microsoft.com/office/word/2010/wordprocessingCanvas" xmlns:cx="http://schemas.microsoft.com/office/drawing/2014/chartex" xmlns:cx1="http://schemas.microsoft.com/office/drawing/2015/9/8/chartex" xmlns:cx2="http://schemas.microsoft.com/office/drawing/2015/10/21/chartex" xmlns:cx3="http://schemas.microsoft.com/office/drawing/2016/5/9/chartex" xmlns:cx4="http://schemas.microsoft.com/office/drawing/2016/5/10/chartex" xmlns:cx5="http://schemas.microsoft.com/office/drawing/2016/5/11/chartex" xmlns:cx6="http://schemas.microsoft.com/office/drawing/2016/5/12/chartex" xmlns:cx7="http://schemas.microsoft.com/office/drawing/2016/5/13/chartex" xmlns:cx8="http://schemas.microsoft.com/office/drawing/2016/5/14/chartex" xmlns:mc="http://schemas.openxmlformats.org/markup-compatibility/2006" xmlns:m="http://schemas.openxmlformats.org/officeDocument/2006/math" xmlns:aink="http://schemas.microsoft.com/office/drawing/2016/ink" xmlns:am3d="http://schemas.microsoft.com/office/drawing/2017/model3d" xmlns:oel="http://schemas.microsoft.com/office/2019/extlst" xmlns:r="http://schemas.openxmlformats.org/officeDocument/2006/relationships" xmlns:wp14="http://schemas.microsoft.com/office/word/2010/wordprocessingDrawing" xmlns:wp="http://schemas.openxmlformats.org/drawingml/2006/wordprocessingDrawing" xmlns:wpg="http://schemas.microsoft.com/office/word/2010/wordprocessingGroup" xmlns:wpi="http://schemas.microsoft.com/office/word/2010/wordprocessingInk" xmlns:wps="http://schemas.microsoft.com/office/word/2010/wordprocessingShape" xmlns:o="urn:schemas-microsoft-com:office:office" xmlns:v="urn:schemas-microsoft-com:vml" xmlns:w10="urn:schemas-microsoft-com:office:word" xmlns:w="http://schemas.openxmlformats.org/wordprocessingml/2006/main" xmlns:w14="http://schemas.microsoft.com/office/word/2010/wordml" xmlns:w15="http://schemas.microsoft.com/office/word/2012/wordml" xmlns:w16cex="http://schemas.microsoft.com/office/word/2018/wordml/cex" xmlns:w16cid="http://schemas.microsoft.com/office/word/2016/wordml/cid" xmlns:w16="http://schemas.microsoft.com/office/word/2018/wordml" xmlns:w16sdtdh="http://schemas.microsoft.com/office/word/2020/wordml/sdtdatahash" xmlns:w16sdtfl="http://schemas.microsoft.com/office/word/2024/wordml/sdtformatlock" xmlns:w16se="http://schemas.microsoft.com/office/word/2015/wordml/symex" xmlns:w16du="http://schemas.microsoft.com/office/word/2023/wordml/word16du" xmlns:wne="http://schemas.microsoft.com/office/word/2006/wordml" mc:Ignorable="w14 w15 w16se w16cid w16 w16cex w16sdtdh w16sdtfl w16du wp14">
+  <w:p/>
+</w:ftr>
+</file>
+
+<file path=word/footer3.xml><?xml version="1.0" encoding="utf-8"?>
+<w:ftr xmlns:wpc="http://schemas.microsoft.com/office/word/2010/wordprocessingCanvas" xmlns:cx="http://schemas.microsoft.com/office/drawing/2014/chartex" xmlns:cx1="http://schemas.microsoft.com/office/drawing/2015/9/8/chartex" xmlns:cx2="http://schemas.microsoft.com/office/drawing/2015/10/21/chartex" xmlns:cx3="http://schemas.microsoft.com/office/drawing/2016/5/9/chartex" xmlns:cx4="http://schemas.microsoft.com/office/drawing/2016/5/10/chartex" xmlns:cx5="http://schemas.microsoft.com/office/drawing/2016/5/11/chartex" xmlns:cx6="http://schemas.microsoft.com/office/drawing/2016/5/12/chartex" xmlns:cx7="http://schemas.microsoft.com/office/drawing/2016/5/13/chartex" xmlns:cx8="http://schemas.microsoft.com/office/drawing/2016/5/14/chartex" xmlns:mc="http://schemas.openxmlformats.org/markup-compatibility/2006" xmlns:m="http://schemas.openxmlformats.org/officeDocument/2006/math" xmlns:aink="http://schemas.microsoft.com/office/drawing/2016/ink" xmlns:am3d="http://schemas.microsoft.com/office/drawing/2017/model3d" xmlns:oel="http://schemas.microsoft.com/office/2019/extlst" xmlns:r="http://schemas.openxmlformats.org/officeDocument/2006/relationships" xmlns:wp14="http://schemas.microsoft.com/office/word/2010/wordprocessingDrawing" xmlns:wp="http://schemas.openxmlformats.org/drawingml/2006/wordprocessingDrawing" xmlns:wpg="http://schemas.microsoft.com/office/word/2010/wordprocessingGroup" xmlns:wpi="http://schemas.microsoft.com/office/word/2010/wordprocessingInk" xmlns:wps="http://schemas.microsoft.com/office/word/2010/wordprocessingShape" xmlns:o="urn:schemas-microsoft-com:office:office" xmlns:v="urn:schemas-microsoft-com:vml" xmlns:w10="urn:schemas-microsoft-com:office:word" xmlns:w="http://schemas.openxmlformats.org/wordprocessingml/2006/main" xmlns:w14="http://schemas.microsoft.com/office/word/2010/wordml" xmlns:w15="http://schemas.microsoft.com/office/word/2012/wordml" xmlns:w16cex="http://schemas.microsoft.com/office/word/2018/wordml/cex" xmlns:w16cid="http://schemas.microsoft.com/office/word/2016/wordml/cid" xmlns:w16="http://schemas.microsoft.com/office/word/2018/wordml" xmlns:w16sdtdh="http://schemas.microsoft.com/office/word/2020/wordml/sdtdatahash" xmlns:w16sdtfl="http://schemas.microsoft.com/office/word/2024/wordml/sdtformatlock" xmlns:w16se="http://schemas.microsoft.com/office/word/2015/wordml/symex" xmlns:w16du="http://schemas.microsoft.com/office/word/2023/wordml/word16du" xmlns:wne="http://schemas.microsoft.com/office/word/2006/wordml" mc:Ignorable="w14 w15 w16se w16cid w16 w16cex w16sdtdh w16sdtfl w16du wp14">
+  <w:p>
+    <w:pPr>
+      <w:spacing w:after="0" w:line="240" w:lineRule="auto"/>
+      <w:ind w:firstLine="0"/>
+      <w:jc w:val="right"/>
+    </w:pPr>
+    <w:r>
+      <w:fldChar w:fldCharType="begin"/>
+    </w:r>
+    <w:r>
+      <w:instrText>PAGE</w:instrText>
+    </w:r>
+    <w:r>
+      <w:fldChar w:fldCharType="separate"/>
+    </w:r>
+    <w:r>
+      <w:rPr>
+        <w:sz w:val="24"/>
+      </w:rPr>
+      <w:t>2</w:t>
+    </w:r>
+    <w:r>
+      <w:rPr>
+        <w:sz w:val="24"/>
+      </w:rPr>
+      <w:fldChar w:fldCharType="end"/>
+    </w:r>
+  </w:p>
+</w:ftr>
+</file>
+
 <file path=word/footnotes.xml><?xml version="1.0" encoding="utf-8"?>
 <w:footnotes xmlns:w="http://schemas.openxmlformats.org/wordprocessingml/2006/main" xmlns:m="http://schemas.openxmlformats.org/officeDocument/2006/math" xmlns:r="http://schemas.openxmlformats.org/officeDocument/2006/relationships" xmlns:o="urn:schemas-microsoft-com:office:office" xmlns:v="urn:schemas-microsoft-com:vml" xmlns:w10="urn:schemas-microsoft-com:office:word" xmlns:a="http://schemas.openxmlformats.org/drawingml/2006/main" xmlns:pic="http://schemas.openxmlformats.org/drawingml/2006/picture" xmlns:wp="http://schemas.openxmlformats.org/drawingml/2006/wordprocessingDrawing">
   <w:footnote w:type="continuationSeparator" w:id="0">
@@ -10368,8 +10445,103 @@
 </w:footnotes>
 </file>
 
+<file path=word/header1.xml><?xml version="1.0" encoding="utf-8"?>
+<w:hdr xmlns:wpc="http://schemas.microsoft.com/office/word/2010/wordprocessingCanvas" xmlns:cx="http://schemas.microsoft.com/office/drawing/2014/chartex" xmlns:cx1="http://schemas.microsoft.com/office/drawing/2015/9/8/chartex" xmlns:cx2="http://schemas.microsoft.com/office/drawing/2015/10/21/chartex" xmlns:cx3="http://schemas.microsoft.com/office/drawing/2016/5/9/chartex" xmlns:cx4="http://schemas.microsoft.com/office/drawing/2016/5/10/chartex" xmlns:cx5="http://schemas.microsoft.com/office/drawing/2016/5/11/chartex" xmlns:cx6="http://schemas.microsoft.com/office/drawing/2016/5/12/chartex" xmlns:cx7="http://schemas.microsoft.com/office/drawing/2016/5/13/chartex" xmlns:cx8="http://schemas.microsoft.com/office/drawing/2016/5/14/chartex" xmlns:mc="http://schemas.openxmlformats.org/markup-compatibility/2006" xmlns:m="http://schemas.openxmlformats.org/officeDocument/2006/math" xmlns:aink="http://schemas.microsoft.com/office/drawing/2016/ink" xmlns:am3d="http://schemas.microsoft.com/office/drawing/2017/model3d" xmlns:oel="http://schemas.microsoft.com/office/2019/extlst" xmlns:r="http://schemas.openxmlformats.org/officeDocument/2006/relationships" xmlns:wp14="http://schemas.microsoft.com/office/word/2010/wordprocessingDrawing" xmlns:wp="http://schemas.openxmlformats.org/drawingml/2006/wordprocessingDrawing" xmlns:wpg="http://schemas.microsoft.com/office/word/2010/wordprocessingGroup" xmlns:wpi="http://schemas.microsoft.com/office/word/2010/wordprocessingInk" xmlns:wps="http://schemas.microsoft.com/office/word/2010/wordprocessingShape" xmlns:o="urn:schemas-microsoft-com:office:office" xmlns:v="urn:schemas-microsoft-com:vml" xmlns:w10="urn:schemas-microsoft-com:office:word" xmlns:w="http://schemas.openxmlformats.org/wordprocessingml/2006/main" xmlns:w14="http://schemas.microsoft.com/office/word/2010/wordml" xmlns:w15="http://schemas.microsoft.com/office/word/2012/wordml" xmlns:w16cex="http://schemas.microsoft.com/office/word/2018/wordml/cex" xmlns:w16cid="http://schemas.microsoft.com/office/word/2016/wordml/cid" xmlns:w16="http://schemas.microsoft.com/office/word/2018/wordml" xmlns:w16sdtdh="http://schemas.microsoft.com/office/word/2020/wordml/sdtdatahash" xmlns:w16sdtfl="http://schemas.microsoft.com/office/word/2024/wordml/sdtformatlock" xmlns:w16se="http://schemas.microsoft.com/office/word/2015/wordml/symex" xmlns:w16du="http://schemas.microsoft.com/office/word/2023/wordml/word16du" xmlns:wne="http://schemas.microsoft.com/office/word/2006/wordml" mc:Ignorable="w14 w15 w16se w16cid w16 w16cex w16sdtdh w16sdtfl w16du wp14">
+  <w:p/>
+</w:hdr>
+</file>
+
+<file path=word/header2.xml><?xml version="1.0" encoding="utf-8"?>
+<w:hdr xmlns:wpc="http://schemas.microsoft.com/office/word/2010/wordprocessingCanvas" xmlns:cx="http://schemas.microsoft.com/office/drawing/2014/chartex" xmlns:cx1="http://schemas.microsoft.com/office/drawing/2015/9/8/chartex" xmlns:cx2="http://schemas.microsoft.com/office/drawing/2015/10/21/chartex" xmlns:cx3="http://schemas.microsoft.com/office/drawing/2016/5/9/chartex" xmlns:cx4="http://schemas.microsoft.com/office/drawing/2016/5/10/chartex" xmlns:cx5="http://schemas.microsoft.com/office/drawing/2016/5/11/chartex" xmlns:cx6="http://schemas.microsoft.com/office/drawing/2016/5/12/chartex" xmlns:cx7="http://schemas.microsoft.com/office/drawing/2016/5/13/chartex" xmlns:cx8="http://schemas.microsoft.com/office/drawing/2016/5/14/chartex" xmlns:mc="http://schemas.openxmlformats.org/markup-compatibility/2006" xmlns:m="http://schemas.openxmlformats.org/officeDocument/2006/math" xmlns:aink="http://schemas.microsoft.com/office/drawing/2016/ink" xmlns:am3d="http://schemas.microsoft.com/office/drawing/2017/model3d" xmlns:oel="http://schemas.microsoft.com/office/2019/extlst" xmlns:r="http://schemas.openxmlformats.org/officeDocument/2006/relationships" xmlns:wp14="http://schemas.microsoft.com/office/word/2010/wordprocessingDrawing" xmlns:wp="http://schemas.openxmlformats.org/drawingml/2006/wordprocessingDrawing" xmlns:wpg="http://schemas.microsoft.com/office/word/2010/wordprocessingGroup" xmlns:wpi="http://schemas.microsoft.com/office/word/2010/wordprocessingInk" xmlns:wps="http://schemas.microsoft.com/office/word/2010/wordprocessingShape" xmlns:o="urn:schemas-microsoft-com:office:office" xmlns:v="urn:schemas-microsoft-com:vml" xmlns:w10="urn:schemas-microsoft-com:office:word" xmlns:w="http://schemas.openxmlformats.org/wordprocessingml/2006/main" xmlns:w14="http://schemas.microsoft.com/office/word/2010/wordml" xmlns:w15="http://schemas.microsoft.com/office/word/2012/wordml" xmlns:w16cex="http://schemas.microsoft.com/office/word/2018/wordml/cex" xmlns:w16cid="http://schemas.microsoft.com/office/word/2016/wordml/cid" xmlns:w16="http://schemas.microsoft.com/office/word/2018/wordml" xmlns:w16sdtdh="http://schemas.microsoft.com/office/word/2020/wordml/sdtdatahash" xmlns:w16sdtfl="http://schemas.microsoft.com/office/word/2024/wordml/sdtformatlock" xmlns:w16se="http://schemas.microsoft.com/office/word/2015/wordml/symex" xmlns:w16du="http://schemas.microsoft.com/office/word/2023/wordml/word16du" xmlns:wne="http://schemas.microsoft.com/office/word/2006/wordml" mc:Ignorable="w14 w15 w16se w16cid w16 w16cex w16sdtdh w16sdtfl w16du wp14">
+  <w:p/>
+</w:hdr>
+</file>
+
+<file path=word/header3.xml><?xml version="1.0" encoding="utf-8"?>
+<w:hdr xmlns:wpc="http://schemas.microsoft.com/office/word/2010/wordprocessingCanvas" xmlns:cx="http://schemas.microsoft.com/office/drawing/2014/chartex" xmlns:cx1="http://schemas.microsoft.com/office/drawing/2015/9/8/chartex" xmlns:cx2="http://schemas.microsoft.com/office/drawing/2015/10/21/chartex" xmlns:cx3="http://schemas.microsoft.com/office/drawing/2016/5/9/chartex" xmlns:cx4="http://schemas.microsoft.com/office/drawing/2016/5/10/chartex" xmlns:cx5="http://schemas.microsoft.com/office/drawing/2016/5/11/chartex" xmlns:cx6="http://schemas.microsoft.com/office/drawing/2016/5/12/chartex" xmlns:cx7="http://schemas.microsoft.com/office/drawing/2016/5/13/chartex" xmlns:cx8="http://schemas.microsoft.com/office/drawing/2016/5/14/chartex" xmlns:mc="http://schemas.openxmlformats.org/markup-compatibility/2006" xmlns:m="http://schemas.openxmlformats.org/officeDocument/2006/math" xmlns:aink="http://schemas.microsoft.com/office/drawing/2016/ink" xmlns:am3d="http://schemas.microsoft.com/office/drawing/2017/model3d" xmlns:oel="http://schemas.microsoft.com/office/2019/extlst" xmlns:r="http://schemas.openxmlformats.org/officeDocument/2006/relationships" xmlns:wp14="http://schemas.microsoft.com/office/word/2010/wordprocessingDrawing" xmlns:wp="http://schemas.openxmlformats.org/drawingml/2006/wordprocessingDrawing" xmlns:wpg="http://schemas.microsoft.com/office/word/2010/wordprocessingGroup" xmlns:wpi="http://schemas.microsoft.com/office/word/2010/wordprocessingInk" xmlns:wps="http://schemas.microsoft.com/office/word/2010/wordprocessingShape" xmlns:o="urn:schemas-microsoft-com:office:office" xmlns:v="urn:schemas-microsoft-com:vml" xmlns:w10="urn:schemas-microsoft-com:office:word" xmlns:w="http://schemas.openxmlformats.org/wordprocessingml/2006/main" xmlns:w14="http://schemas.microsoft.com/office/word/2010/wordml" xmlns:w15="http://schemas.microsoft.com/office/word/2012/wordml" xmlns:w16cex="http://schemas.microsoft.com/office/word/2018/wordml/cex" xmlns:w16cid="http://schemas.microsoft.com/office/word/2016/wordml/cid" xmlns:w16="http://schemas.microsoft.com/office/word/2018/wordml" xmlns:w16sdtdh="http://schemas.microsoft.com/office/word/2020/wordml/sdtdatahash" xmlns:w16sdtfl="http://schemas.microsoft.com/office/word/2024/wordml/sdtformatlock" xmlns:w16se="http://schemas.microsoft.com/office/word/2015/wordml/symex" xmlns:w16du="http://schemas.microsoft.com/office/word/2023/wordml/word16du" xmlns:wne="http://schemas.microsoft.com/office/word/2006/wordml" mc:Ignorable="w14 w15 w16se w16cid w16 w16cex w16sdtdh w16sdtfl w16du wp14">
+  <w:p/>
+</w:hdr>
+</file>
+
 <file path=word/numbering.xml><?xml version="1.0" encoding="utf-8"?>
-<w:numbering xmlns:w="http://schemas.openxmlformats.org/wordprocessingml/2006/main">
+<w:numbering xmlns:aink="http://schemas.microsoft.com/office/drawing/2016/ink" xmlns:am3d="http://schemas.microsoft.com/office/drawing/2017/model3d" xmlns:cx="http://schemas.microsoft.com/office/drawing/2014/chartex" xmlns:cx1="http://schemas.microsoft.com/office/drawing/2015/9/8/chartex" xmlns:cx2="http://schemas.microsoft.com/office/drawing/2015/10/21/chartex" xmlns:cx3="http://schemas.microsoft.com/office/drawing/2016/5/9/chartex" xmlns:cx4="http://schemas.microsoft.com/office/drawing/2016/5/10/chartex" xmlns:cx5="http://schemas.microsoft.com/office/drawing/2016/5/11/chartex" xmlns:cx6="http://schemas.microsoft.com/office/drawing/2016/5/12/chartex" xmlns:cx7="http://schemas.microsoft.com/office/drawing/2016/5/13/chartex" xmlns:cx8="http://schemas.microsoft.com/office/drawing/2016/5/14/chartex" xmlns:m="http://schemas.openxmlformats.org/officeDocument/2006/math" xmlns:mc="http://schemas.openxmlformats.org/markup-compatibility/2006" xmlns:o="urn:schemas-microsoft-com:office:office" xmlns:oel="http://schemas.microsoft.com/office/2019/extlst" xmlns:r="http://schemas.openxmlformats.org/officeDocument/2006/relationships" xmlns:v="urn:schemas-microsoft-com:vml" xmlns:w="http://schemas.openxmlformats.org/wordprocessingml/2006/main" xmlns:w10="urn:schemas-microsoft-com:office:word" xmlns:w14="http://schemas.microsoft.com/office/word/2010/wordml" xmlns:w15="http://schemas.microsoft.com/office/word/2012/wordml" xmlns:w16="http://schemas.microsoft.com/office/word/2018/wordml" xmlns:w16cex="http://schemas.microsoft.com/office/word/2018/wordml/cex" xmlns:w16cid="http://schemas.microsoft.com/office/word/2016/wordml/cid" xmlns:w16du="http://schemas.microsoft.com/office/word/2023/wordml/word16du" xmlns:w16sdtdh="http://schemas.microsoft.com/office/word/2020/wordml/sdtdatahash" xmlns:w16sdtfl="http://schemas.microsoft.com/office/word/2024/wordml/sdtformatlock" xmlns:w16se="http://schemas.microsoft.com/office/word/2015/wordml/symex" xmlns:wne="http://schemas.microsoft.com/office/word/2006/wordml" xmlns:wp="http://schemas.openxmlformats.org/drawingml/2006/wordprocessingDrawing" xmlns:wp14="http://schemas.microsoft.com/office/word/2010/wordprocessingDrawing" xmlns:wpc="http://schemas.microsoft.com/office/word/2010/wordprocessingCanvas" xmlns:wpg="http://schemas.microsoft.com/office/word/2010/wordprocessingGroup" xmlns:wpi="http://schemas.microsoft.com/office/word/2010/wordprocessingInk" xmlns:wps="http://schemas.microsoft.com/office/word/2010/wordprocessingShape" mc:Ignorable="w14 w15 w16se w16cid w16 w16cex w16sdtdh w16sdtfl w16du wp14">
+  <w:abstractNum w15:restartNumberingAfterBreak="0" w:abstractNumId="0">
+    <w:nsid w:val="0000A990"/>
+    <w:multiLevelType w:val="multilevel"/>
+    <w:tmpl w:val="9D08A782"/>
+    <w:lvl w:ilvl="0">
+      <w:numFmt w:val="bullet"/>
+      <w:lvlText w:val=" "/>
+      <w:lvlJc w:val="left"/>
+      <w:pPr>
+        <w:ind w:hanging="360" w:left="720"/>
+      </w:pPr>
+    </w:lvl>
+    <w:lvl w:ilvl="1">
+      <w:numFmt w:val="bullet"/>
+      <w:lvlText w:val=" "/>
+      <w:lvlJc w:val="left"/>
+      <w:pPr>
+        <w:ind w:hanging="360" w:left="1440"/>
+      </w:pPr>
+    </w:lvl>
+    <w:lvl w:ilvl="2">
+      <w:numFmt w:val="bullet"/>
+      <w:lvlText w:val=" "/>
+      <w:lvlJc w:val="left"/>
+      <w:pPr>
+        <w:ind w:hanging="360" w:left="2160"/>
+      </w:pPr>
+    </w:lvl>
+    <w:lvl w:ilvl="3">
+      <w:numFmt w:val="bullet"/>
+      <w:lvlText w:val=" "/>
+      <w:lvlJc w:val="left"/>
+      <w:pPr>
+        <w:ind w:hanging="360" w:left="2880"/>
+      </w:pPr>
+    </w:lvl>
+    <w:lvl w:ilvl="4">
+      <w:numFmt w:val="bullet"/>
+      <w:lvlText w:val=" "/>
+      <w:lvlJc w:val="left"/>
+      <w:pPr>
+        <w:ind w:hanging="360" w:left="3600"/>
+      </w:pPr>
+    </w:lvl>
+    <w:lvl w:ilvl="5">
+      <w:numFmt w:val="bullet"/>
+      <w:lvlText w:val=" "/>
+      <w:lvlJc w:val="left"/>
+      <w:pPr>
+        <w:ind w:hanging="360" w:left="4320"/>
+      </w:pPr>
+    </w:lvl>
+    <w:lvl w:ilvl="6">
+      <w:numFmt w:val="bullet"/>
+      <w:lvlText w:val=" "/>
+      <w:lvlJc w:val="left"/>
+      <w:pPr>
+        <w:ind w:hanging="360" w:left="5040"/>
+      </w:pPr>
+    </w:lvl>
+    <w:lvl w:ilvl="7">
+      <w:numFmt w:val="bullet"/>
+      <w:lvlText w:val=" "/>
+      <w:lvlJc w:val="left"/>
+      <w:pPr>
+        <w:ind w:hanging="360" w:left="5760"/>
+      </w:pPr>
+    </w:lvl>
+    <w:lvl w:ilvl="8">
+      <w:numFmt w:val="bullet"/>
+      <w:lvlText w:val=" "/>
+      <w:lvlJc w:val="left"/>
+      <w:pPr>
+        <w:ind w:hanging="360" w:left="6480"/>
+      </w:pPr>
+    </w:lvl>
+  </w:abstractNum>
   <w:abstractNum w:abstractNumId="990">
     <w:nsid w:val="0000A990"/>
     <w:multiLevelType w:val="multilevel"/>
@@ -10634,6 +10806,9 @@
       </w:pPr>
     </w:lvl>
   </w:abstractNum>
+  <w:num w16cid:durableId="312370380" w:numId="1">
+    <w:abstractNumId w:val="0"/>
+  </w:num>
   <w:num w:numId="1000">
     <w:abstractNumId w:val="990"/>
   </w:num>
@@ -10914,7 +11089,7 @@
 </file>
 
 <file path=word/styles.xml><?xml version="1.0" encoding="utf-8"?>
-<w:styles xmlns:r="http://schemas.openxmlformats.org/officeDocument/2006/relationships" xmlns:w="http://schemas.openxmlformats.org/wordprocessingml/2006/main">
+<w:styles xmlns:mc="http://schemas.openxmlformats.org/markup-compatibility/2006" xmlns:r="http://schemas.openxmlformats.org/officeDocument/2006/relationships" xmlns:w="http://schemas.openxmlformats.org/wordprocessingml/2006/main" xmlns:w14="http://schemas.microsoft.com/office/word/2010/wordml" xmlns:w15="http://schemas.microsoft.com/office/word/2012/wordml" xmlns:w16="http://schemas.microsoft.com/office/word/2018/wordml" xmlns:w16cex="http://schemas.microsoft.com/office/word/2018/wordml/cex" xmlns:w16cid="http://schemas.microsoft.com/office/word/2016/wordml/cid" xmlns:w16du="http://schemas.microsoft.com/office/word/2023/wordml/word16du" xmlns:w16sdtdh="http://schemas.microsoft.com/office/word/2020/wordml/sdtdatahash" xmlns:w16sdtfl="http://schemas.microsoft.com/office/word/2024/wordml/sdtformatlock" xmlns:w16se="http://schemas.microsoft.com/office/word/2015/wordml/symex" mc:Ignorable="w14 w15 w16se w16cid w16 w16cex w16sdtdh w16sdtfl w16du">
   <w:docDefaults>
     <w:rPrDefault>
       <w:rPr>
@@ -10930,166 +11105,261 @@
       </w:pPr>
     </w:pPrDefault>
   </w:docDefaults>
-  <w:latentStyles w:count="276" w:defLockedState="0" w:defQFormat="0" w:defSemiHidden="0" w:defUIPriority="0" w:defUnhideWhenUsed="0"/>
+  <w:latentStyles w:count="376" w:defLockedState="0" w:defQFormat="0" w:defSemiHidden="0" w:defUIPriority="0" w:defUnhideWhenUsed="0">
+    <w:lsdException w:name="Normal Table" w:semiHidden="1" w:unhideWhenUsed="1"/>
+    <w:lsdException w:name="Table Simple 1" w:semiHidden="1" w:unhideWhenUsed="1"/>
+    <w:lsdException w:name="Table Simple 2" w:semiHidden="1" w:unhideWhenUsed="1"/>
+    <w:lsdException w:name="Table Simple 3" w:semiHidden="1" w:unhideWhenUsed="1"/>
+    <w:lsdException w:name="Table Classic 1" w:semiHidden="1" w:unhideWhenUsed="1"/>
+    <w:lsdException w:name="Table Classic 2" w:semiHidden="1" w:unhideWhenUsed="1"/>
+    <w:lsdException w:name="Table Classic 3" w:semiHidden="1" w:unhideWhenUsed="1"/>
+    <w:lsdException w:name="Table Classic 4" w:semiHidden="1" w:unhideWhenUsed="1"/>
+    <w:lsdException w:name="Table Colorful 1" w:semiHidden="1" w:unhideWhenUsed="1"/>
+    <w:lsdException w:name="Table Colorful 2" w:semiHidden="1" w:unhideWhenUsed="1"/>
+    <w:lsdException w:name="Table Colorful 3" w:semiHidden="1" w:unhideWhenUsed="1"/>
+    <w:lsdException w:name="Table Columns 1" w:semiHidden="1" w:unhideWhenUsed="1"/>
+    <w:lsdException w:name="Table Columns 2" w:semiHidden="1" w:unhideWhenUsed="1"/>
+    <w:lsdException w:name="Table Columns 3" w:semiHidden="1" w:unhideWhenUsed="1"/>
+    <w:lsdException w:name="Table Columns 4" w:semiHidden="1" w:unhideWhenUsed="1"/>
+    <w:lsdException w:name="Table Columns 5" w:semiHidden="1" w:unhideWhenUsed="1"/>
+    <w:lsdException w:name="Table Grid 1" w:semiHidden="1" w:unhideWhenUsed="1"/>
+    <w:lsdException w:name="Table Grid 2" w:semiHidden="1" w:unhideWhenUsed="1"/>
+    <w:lsdException w:name="Table Grid 3" w:semiHidden="1" w:unhideWhenUsed="1"/>
+    <w:lsdException w:name="Table Grid 4" w:semiHidden="1" w:unhideWhenUsed="1"/>
+    <w:lsdException w:name="Table Grid 5" w:semiHidden="1" w:unhideWhenUsed="1"/>
+    <w:lsdException w:name="Table Grid 6" w:semiHidden="1" w:unhideWhenUsed="1"/>
+    <w:lsdException w:name="Table Grid 7" w:semiHidden="1" w:unhideWhenUsed="1"/>
+    <w:lsdException w:name="Table Grid 8" w:semiHidden="1" w:unhideWhenUsed="1"/>
+    <w:lsdException w:name="Table List 1" w:semiHidden="1" w:unhideWhenUsed="1"/>
+    <w:lsdException w:name="Table List 2" w:semiHidden="1" w:unhideWhenUsed="1"/>
+    <w:lsdException w:name="Table List 3" w:semiHidden="1" w:unhideWhenUsed="1"/>
+    <w:lsdException w:name="Table List 4" w:semiHidden="1" w:unhideWhenUsed="1"/>
+    <w:lsdException w:name="Table List 5" w:semiHidden="1" w:unhideWhenUsed="1"/>
+    <w:lsdException w:name="Table List 6" w:semiHidden="1" w:unhideWhenUsed="1"/>
+    <w:lsdException w:name="Table List 7" w:semiHidden="1" w:unhideWhenUsed="1"/>
+    <w:lsdException w:name="Table List 8" w:semiHidden="1" w:unhideWhenUsed="1"/>
+    <w:lsdException w:name="Table 3D effects 1" w:semiHidden="1" w:unhideWhenUsed="1"/>
+    <w:lsdException w:name="Table 3D effects 2" w:semiHidden="1" w:unhideWhenUsed="1"/>
+    <w:lsdException w:name="Table 3D effects 3" w:semiHidden="1" w:unhideWhenUsed="1"/>
+    <w:lsdException w:name="Table Contemporary" w:semiHidden="1" w:unhideWhenUsed="1"/>
+    <w:lsdException w:name="Table Elegant" w:semiHidden="1" w:unhideWhenUsed="1"/>
+    <w:lsdException w:name="Table Professional" w:semiHidden="1" w:unhideWhenUsed="1"/>
+    <w:lsdException w:name="Table Subtle 1" w:semiHidden="1" w:unhideWhenUsed="1"/>
+    <w:lsdException w:name="Table Subtle 2" w:semiHidden="1" w:unhideWhenUsed="1"/>
+    <w:lsdException w:name="Table Web 1" w:semiHidden="1" w:unhideWhenUsed="1"/>
+    <w:lsdException w:name="Table Web 2" w:semiHidden="1" w:unhideWhenUsed="1"/>
+    <w:lsdException w:name="Table Web 3" w:semiHidden="1" w:unhideWhenUsed="1"/>
+    <w:lsdException w:name="Table Theme" w:semiHidden="1" w:unhideWhenUsed="1"/>
+    <w:lsdException w:name="Light Shading"/>
+    <w:lsdException w:name="Light List"/>
+    <w:lsdException w:name="Light Grid"/>
+    <w:lsdException w:name="Medium Shading 1"/>
+    <w:lsdException w:name="Medium Shading 2"/>
+    <w:lsdException w:name="Medium List 1"/>
+    <w:lsdException w:name="Medium List 2"/>
+    <w:lsdException w:name="Medium Grid 1"/>
+    <w:lsdException w:name="Medium Grid 2"/>
+    <w:lsdException w:name="Medium Grid 3"/>
+    <w:lsdException w:name="Dark List"/>
+    <w:lsdException w:name="Colorful Shading"/>
+    <w:lsdException w:name="Colorful List"/>
+    <w:lsdException w:name="Colorful Grid"/>
+    <w:lsdException w:name="Light Shading Accent 1"/>
+    <w:lsdException w:name="Light List Accent 1"/>
+    <w:lsdException w:name="Light Grid Accent 1"/>
+    <w:lsdException w:name="Medium Shading 1 Accent 1"/>
+    <w:lsdException w:name="Medium Shading 2 Accent 1"/>
+    <w:lsdException w:name="Medium List 1 Accent 1"/>
+    <w:lsdException w:name="Medium List 2 Accent 1"/>
+    <w:lsdException w:name="Medium Grid 1 Accent 1"/>
+    <w:lsdException w:name="Medium Grid 2 Accent 1"/>
+    <w:lsdException w:name="Medium Grid 3 Accent 1"/>
+    <w:lsdException w:name="Dark List Accent 1"/>
+    <w:lsdException w:name="Colorful Shading Accent 1"/>
+    <w:lsdException w:name="Colorful List Accent 1"/>
+    <w:lsdException w:name="Colorful Grid Accent 1"/>
+    <w:lsdException w:name="Light Shading Accent 2"/>
+    <w:lsdException w:name="Light List Accent 2"/>
+    <w:lsdException w:name="Light Grid Accent 2"/>
+    <w:lsdException w:name="Medium Shading 1 Accent 2"/>
+    <w:lsdException w:name="Medium Shading 2 Accent 2"/>
+    <w:lsdException w:name="Medium List 1 Accent 2"/>
+    <w:lsdException w:name="Medium List 2 Accent 2"/>
+    <w:lsdException w:name="Medium Grid 1 Accent 2"/>
+    <w:lsdException w:name="Medium Grid 2 Accent 2"/>
+    <w:lsdException w:name="Medium Grid 3 Accent 2"/>
+    <w:lsdException w:name="Dark List Accent 2"/>
+    <w:lsdException w:name="Colorful Shading Accent 2"/>
+    <w:lsdException w:name="Colorful List Accent 2"/>
+    <w:lsdException w:name="Colorful Grid Accent 2"/>
+    <w:lsdException w:name="Light Shading Accent 3"/>
+    <w:lsdException w:name="Light List Accent 3"/>
+    <w:lsdException w:name="Light Grid Accent 3"/>
+    <w:lsdException w:name="Medium Shading 1 Accent 3"/>
+    <w:lsdException w:name="Medium Shading 2 Accent 3"/>
+    <w:lsdException w:name="Medium List 1 Accent 3"/>
+    <w:lsdException w:name="Medium List 2 Accent 3"/>
+    <w:lsdException w:name="Medium Grid 1 Accent 3"/>
+    <w:lsdException w:name="Medium Grid 2 Accent 3"/>
+    <w:lsdException w:name="Medium Grid 3 Accent 3"/>
+    <w:lsdException w:name="Dark List Accent 3"/>
+    <w:lsdException w:name="Colorful Shading Accent 3"/>
+    <w:lsdException w:name="Colorful List Accent 3"/>
+    <w:lsdException w:name="Colorful Grid Accent 3"/>
+    <w:lsdException w:name="Light Shading Accent 4"/>
+    <w:lsdException w:name="Light List Accent 4"/>
+    <w:lsdException w:name="Light Grid Accent 4"/>
+    <w:lsdException w:name="Medium Shading 1 Accent 4"/>
+    <w:lsdException w:name="Medium Shading 2 Accent 4"/>
+    <w:lsdException w:name="Medium List 1 Accent 4"/>
+    <w:lsdException w:name="Medium List 2 Accent 4"/>
+    <w:lsdException w:name="Medium Grid 1 Accent 4"/>
+    <w:lsdException w:name="Medium Grid 2 Accent 4"/>
+    <w:lsdException w:name="Medium Grid 3 Accent 4"/>
+    <w:lsdException w:name="Dark List Accent 4"/>
+    <w:lsdException w:name="Colorful Shading Accent 4"/>
+    <w:lsdException w:name="Colorful List Accent 4"/>
+    <w:lsdException w:name="Colorful Grid Accent 4"/>
+    <w:lsdException w:name="Light Shading Accent 5"/>
+    <w:lsdException w:name="Light List Accent 5"/>
+    <w:lsdException w:name="Light Grid Accent 5"/>
+    <w:lsdException w:name="Medium Shading 1 Accent 5"/>
+    <w:lsdException w:name="Medium Shading 2 Accent 5"/>
+    <w:lsdException w:name="Medium List 1 Accent 5"/>
+    <w:lsdException w:name="Medium List 2 Accent 5"/>
+    <w:lsdException w:name="Medium Grid 1 Accent 5"/>
+    <w:lsdException w:name="Medium Grid 2 Accent 5"/>
+    <w:lsdException w:name="Medium Grid 3 Accent 5"/>
+    <w:lsdException w:name="Dark List Accent 5"/>
+    <w:lsdException w:name="Colorful Shading Accent 5"/>
+    <w:lsdException w:name="Colorful List Accent 5"/>
+    <w:lsdException w:name="Colorful Grid Accent 5"/>
+    <w:lsdException w:name="Light Shading Accent 6"/>
+    <w:lsdException w:name="Light List Accent 6"/>
+    <w:lsdException w:name="Light Grid Accent 6"/>
+    <w:lsdException w:name="Medium Shading 1 Accent 6"/>
+    <w:lsdException w:name="Medium Shading 2 Accent 6"/>
+    <w:lsdException w:name="Medium List 1 Accent 6"/>
+    <w:lsdException w:name="Medium List 2 Accent 6"/>
+    <w:lsdException w:name="Medium Grid 1 Accent 6"/>
+    <w:lsdException w:name="Medium Grid 2 Accent 6"/>
+    <w:lsdException w:name="Medium Grid 3 Accent 6"/>
+    <w:lsdException w:name="Dark List Accent 6"/>
+    <w:lsdException w:name="Colorful Shading Accent 6"/>
+    <w:lsdException w:name="Colorful List Accent 6"/>
+    <w:lsdException w:name="Colorful Grid Accent 6"/>
+    <w:lsdException w:name="Grid Table 4" w:uiPriority="49"/>
+    <w:lsdException w:name="Grid Table 5 Dark" w:uiPriority="50"/>
+    <w:lsdException w:name="Grid Table 6 Colorful" w:uiPriority="51"/>
+    <w:lsdException w:name="Grid Table 7 Colorful" w:uiPriority="52"/>
+    <w:lsdException w:name="Grid Table 1 Light Accent 1" w:uiPriority="46"/>
+    <w:lsdException w:name="Grid Table 2 Accent 1" w:uiPriority="47"/>
+    <w:lsdException w:name="Grid Table 3 Accent 1" w:uiPriority="48"/>
+    <w:lsdException w:name="Grid Table 4 Accent 1" w:uiPriority="49"/>
+    <w:lsdException w:name="Grid Table 5 Dark Accent 1" w:uiPriority="50"/>
+    <w:lsdException w:name="Grid Table 6 Colorful Accent 1" w:uiPriority="51"/>
+    <w:lsdException w:name="Grid Table 7 Colorful Accent 1" w:uiPriority="52"/>
+    <w:lsdException w:name="Grid Table 1 Light Accent 2" w:uiPriority="46"/>
+    <w:lsdException w:name="Grid Table 2 Accent 2" w:uiPriority="47"/>
+    <w:lsdException w:name="Grid Table 3 Accent 2" w:uiPriority="48"/>
+    <w:lsdException w:name="Grid Table 4 Accent 2" w:uiPriority="49"/>
+    <w:lsdException w:name="Grid Table 5 Dark Accent 2" w:uiPriority="50"/>
+    <w:lsdException w:name="Grid Table 6 Colorful Accent 2" w:uiPriority="51"/>
+    <w:lsdException w:name="Grid Table 7 Colorful Accent 2" w:uiPriority="52"/>
+    <w:lsdException w:name="Grid Table 1 Light Accent 3" w:uiPriority="46"/>
+    <w:lsdException w:name="Grid Table 2 Accent 3" w:uiPriority="47"/>
+    <w:lsdException w:name="Grid Table 3 Accent 3" w:uiPriority="48"/>
+    <w:lsdException w:name="Grid Table 4 Accent 3" w:uiPriority="49"/>
+    <w:lsdException w:name="Grid Table 5 Dark Accent 3" w:uiPriority="50"/>
+    <w:lsdException w:name="Grid Table 6 Colorful Accent 3" w:uiPriority="51"/>
+    <w:lsdException w:name="Grid Table 7 Colorful Accent 3" w:uiPriority="52"/>
+    <w:lsdException w:name="Grid Table 1 Light Accent 4" w:uiPriority="46"/>
+    <w:lsdException w:name="Grid Table 2 Accent 4" w:uiPriority="47"/>
+    <w:lsdException w:name="Grid Table 3 Accent 4" w:uiPriority="48"/>
+    <w:lsdException w:name="Grid Table 4 Accent 4" w:uiPriority="49"/>
+    <w:lsdException w:name="Grid Table 5 Dark Accent 4" w:uiPriority="50"/>
+    <w:lsdException w:name="Grid Table 6 Colorful Accent 4" w:uiPriority="51"/>
+    <w:lsdException w:name="Grid Table 7 Colorful Accent 4" w:uiPriority="52"/>
+    <w:lsdException w:name="Grid Table 1 Light Accent 5" w:uiPriority="46"/>
+    <w:lsdException w:name="Grid Table 2 Accent 5" w:uiPriority="47"/>
+    <w:lsdException w:name="Grid Table 3 Accent 5" w:uiPriority="48"/>
+    <w:lsdException w:name="Grid Table 4 Accent 5" w:uiPriority="49"/>
+    <w:lsdException w:name="Grid Table 5 Dark Accent 5" w:uiPriority="50"/>
+    <w:lsdException w:name="Grid Table 6 Colorful Accent 5" w:uiPriority="51"/>
+    <w:lsdException w:name="Grid Table 7 Colorful Accent 5" w:uiPriority="52"/>
+    <w:lsdException w:name="Grid Table 1 Light Accent 6" w:uiPriority="46"/>
+    <w:lsdException w:name="Grid Table 2 Accent 6" w:uiPriority="47"/>
+    <w:lsdException w:name="Grid Table 3 Accent 6" w:uiPriority="48"/>
+    <w:lsdException w:name="Grid Table 4 Accent 6" w:uiPriority="49"/>
+    <w:lsdException w:name="Grid Table 5 Dark Accent 6" w:uiPriority="50"/>
+    <w:lsdException w:name="Grid Table 6 Colorful Accent 6" w:uiPriority="51"/>
+    <w:lsdException w:name="Grid Table 7 Colorful Accent 6" w:uiPriority="52"/>
+    <w:lsdException w:name="List Table 1 Light" w:uiPriority="46"/>
+    <w:lsdException w:name="List Table 2" w:uiPriority="47"/>
+    <w:lsdException w:name="List Table 3" w:uiPriority="48"/>
+    <w:lsdException w:name="List Table 4" w:uiPriority="49"/>
+    <w:lsdException w:name="List Table 5 Dark" w:uiPriority="50"/>
+    <w:lsdException w:name="List Table 6 Colorful" w:uiPriority="51"/>
+    <w:lsdException w:name="List Table 7 Colorful" w:uiPriority="52"/>
+    <w:lsdException w:name="List Table 1 Light Accent 1" w:uiPriority="46"/>
+    <w:lsdException w:name="List Table 2 Accent 1" w:uiPriority="47"/>
+    <w:lsdException w:name="List Table 3 Accent 1" w:uiPriority="48"/>
+    <w:lsdException w:name="List Table 4 Accent 1" w:uiPriority="49"/>
+    <w:lsdException w:name="List Table 5 Dark Accent 1" w:uiPriority="50"/>
+    <w:lsdException w:name="List Table 6 Colorful Accent 1" w:uiPriority="51"/>
+    <w:lsdException w:name="List Table 7 Colorful Accent 1" w:uiPriority="52"/>
+    <w:lsdException w:name="List Table 1 Light Accent 2" w:uiPriority="46"/>
+    <w:lsdException w:name="List Table 2 Accent 2" w:uiPriority="47"/>
+    <w:lsdException w:name="List Table 3 Accent 2" w:uiPriority="48"/>
+    <w:lsdException w:name="List Table 4 Accent 2" w:uiPriority="49"/>
+    <w:lsdException w:name="List Table 5 Dark Accent 2" w:uiPriority="50"/>
+    <w:lsdException w:name="List Table 6 Colorful Accent 2" w:uiPriority="51"/>
+    <w:lsdException w:name="List Table 7 Colorful Accent 2" w:uiPriority="52"/>
+    <w:lsdException w:name="List Table 1 Light Accent 3" w:uiPriority="46"/>
+    <w:lsdException w:name="List Table 2 Accent 3" w:uiPriority="47"/>
+    <w:lsdException w:name="List Table 3 Accent 3" w:uiPriority="48"/>
+    <w:lsdException w:name="List Table 4 Accent 3" w:uiPriority="49"/>
+    <w:lsdException w:name="List Table 5 Dark Accent 3" w:uiPriority="50"/>
+    <w:lsdException w:name="List Table 6 Colorful Accent 3" w:uiPriority="51"/>
+    <w:lsdException w:name="List Table 7 Colorful Accent 3" w:uiPriority="52"/>
+    <w:lsdException w:name="List Table 1 Light Accent 4" w:uiPriority="46"/>
+    <w:lsdException w:name="List Table 2 Accent 4" w:uiPriority="47"/>
+    <w:lsdException w:name="List Table 3 Accent 4" w:uiPriority="48"/>
+    <w:lsdException w:name="List Table 4 Accent 4" w:uiPriority="49"/>
+    <w:lsdException w:name="List Table 5 Dark Accent 4" w:uiPriority="50"/>
+    <w:lsdException w:name="List Table 6 Colorful Accent 4" w:uiPriority="51"/>
+    <w:lsdException w:name="List Table 7 Colorful Accent 4" w:uiPriority="52"/>
+    <w:lsdException w:name="List Table 1 Light Accent 5" w:uiPriority="46"/>
+    <w:lsdException w:name="List Table 2 Accent 5" w:uiPriority="47"/>
+    <w:lsdException w:name="List Table 3 Accent 5" w:uiPriority="48"/>
+    <w:lsdException w:name="List Table 4 Accent 5" w:uiPriority="49"/>
+    <w:lsdException w:name="List Table 5 Dark Accent 5" w:uiPriority="50"/>
+    <w:lsdException w:name="List Table 6 Colorful Accent 5" w:uiPriority="51"/>
+    <w:lsdException w:name="List Table 7 Colorful Accent 5" w:uiPriority="52"/>
+    <w:lsdException w:name="List Table 1 Light Accent 6" w:uiPriority="46"/>
+    <w:lsdException w:name="List Table 2 Accent 6" w:uiPriority="47"/>
+    <w:lsdException w:name="List Table 3 Accent 6" w:uiPriority="48"/>
+    <w:lsdException w:name="List Table 4 Accent 6" w:uiPriority="49"/>
+    <w:lsdException w:name="List Table 5 Dark Accent 6" w:uiPriority="50"/>
+    <w:lsdException w:name="List Table 6 Colorful Accent 6" w:uiPriority="51"/>
+    <w:lsdException w:name="List Table 7 Colorful Accent 6" w:uiPriority="52"/>
+    <w:lsdException w:name="Mention" w:semiHidden="1" w:uiPriority="99" w:unhideWhenUsed="1"/>
+    <w:lsdException w:name="Smart Hyperlink" w:semiHidden="1" w:uiPriority="99" w:unhideWhenUsed="1"/>
+    <w:lsdException w:name="Hashtag" w:semiHidden="1" w:uiPriority="99" w:unhideWhenUsed="1"/>
+    <w:lsdException w:name="Unresolved Mention" w:semiHidden="1" w:uiPriority="99" w:unhideWhenUsed="1"/>
+    <w:lsdException w:name="Smart Link" w:semiHidden="1" w:uiPriority="99" w:unhideWhenUsed="1"/>
+  </w:latentStyles>
   <w:style w:default="1" w:styleId="Normal" w:type="paragraph">
     <w:name w:val="Normal"/>
     <w:qFormat/>
-  </w:style>
-  <w:style w:styleId="BodyText" w:type="paragraph">
-    <w:name w:val="Body Text"/>
-    <w:basedOn w:val="Normal"/>
-    <w:link w:val="BodyTextChar"/>
-    <w:qFormat/>
     <w:pPr>
-      <w:spacing w:after="180" w:before="180"/>
-    </w:pPr>
-  </w:style>
-  <w:style w:customStyle="1" w:styleId="FirstParagraph" w:type="paragraph">
-    <w:name w:val="First Paragraph"/>
-    <w:basedOn w:val="BodyText"/>
-    <w:next w:val="BodyText"/>
-    <w:qFormat/>
-  </w:style>
-  <w:style w:customStyle="1" w:styleId="Compact" w:type="paragraph">
-    <w:name w:val="Compact"/>
-    <w:basedOn w:val="BodyText"/>
-    <w:qFormat/>
-    <w:pPr>
-      <w:spacing w:after="36" w:before="36"/>
-    </w:pPr>
-  </w:style>
-  <w:style w:styleId="Title" w:type="paragraph">
-    <w:name w:val="Title"/>
-    <w:basedOn w:val="Normal"/>
-    <w:next w:val="BodyText"/>
-    <w:link w:val="TitleChar"/>
-    <w:uiPriority w:val="10"/>
-    <w:qFormat/>
-    <w:rsid w:val="00A10FD9"/>
-    <w:pPr>
-      <w:spacing w:after="80" w:line="240" w:lineRule="auto"/>
-      <w:contextualSpacing/>
-      <w:jc w:val="center"/>
+      <w:spacing w:after="120" w:line="360" w:lineRule="auto"/>
+      <w:ind w:firstLine="425"/>
     </w:pPr>
     <w:rPr>
-      <w:rFonts w:asciiTheme="majorHAnsi" w:cstheme="majorBidi" w:eastAsiaTheme="majorEastAsia" w:hAnsiTheme="majorHAnsi"/>
-      <w:sz w:val="56"/>
-      <w:szCs w:val="56"/>
+      <w:rFonts w:ascii="Times New Roman" w:hAnsi="Times New Roman"/>
+      <w:sz w:val="26"/>
     </w:rPr>
-  </w:style>
-  <w:style w:customStyle="1" w:styleId="TitleChar" w:type="character">
-    <w:name w:val="Title Char"/>
-    <w:basedOn w:val="DefaultParagraphFont"/>
-    <w:link w:val="Title"/>
-    <w:uiPriority w:val="10"/>
-    <w:rsid w:val="00A10FD9"/>
-    <w:rPr>
-      <w:rFonts w:asciiTheme="majorHAnsi" w:cstheme="majorBidi" w:eastAsiaTheme="majorEastAsia" w:hAnsiTheme="majorHAnsi"/>
-      <w:sz w:val="56"/>
-      <w:szCs w:val="56"/>
-    </w:rPr>
-  </w:style>
-  <w:style w:styleId="Subtitle" w:type="paragraph">
-    <w:name w:val="Subtitle"/>
-    <w:basedOn w:val="Title"/>
-    <w:next w:val="BodyText"/>
-    <w:link w:val="SubtitleChar"/>
-    <w:uiPriority w:val="11"/>
-    <w:qFormat/>
-    <w:rsid w:val="00A10FD9"/>
-    <w:pPr>
-      <w:numPr>
-        <w:ilvl w:val="1"/>
-      </w:numPr>
-    </w:pPr>
-    <w:rPr>
-      <w:rFonts w:cstheme="majorBidi" w:eastAsiaTheme="majorEastAsia"/>
-      <w:spacing w:val="15"/>
-      <w:sz w:val="28"/>
-      <w:szCs w:val="28"/>
-    </w:rPr>
-  </w:style>
-  <w:style w:customStyle="1" w:styleId="SubtitleChar" w:type="character">
-    <w:name w:val="Subtitle Char"/>
-    <w:basedOn w:val="DefaultParagraphFont"/>
-    <w:link w:val="Subtitle"/>
-    <w:uiPriority w:val="11"/>
-    <w:rsid w:val="00A10FD9"/>
-    <w:rPr>
-      <w:rFonts w:cstheme="majorBidi" w:eastAsiaTheme="majorEastAsia"/>
-      <w:color w:themeColor="text1" w:themeTint="A6" w:val="595959"/>
-      <w:spacing w:val="15"/>
-      <w:sz w:val="28"/>
-      <w:szCs w:val="28"/>
-    </w:rPr>
-  </w:style>
-  <w:style w:customStyle="1" w:styleId="Author" w:type="paragraph">
-    <w:name w:val="Author"/>
-    <w:basedOn w:val="Title"/>
-    <w:next w:val="BodyText"/>
-    <w:qFormat/>
-    <w:pPr>
-      <w:keepNext/>
-      <w:keepLines/>
-    </w:pPr>
-    <w:rPr>
-      <w:sz w:val="24"/>
-      <w:szCs w:val="24"/>
-    </w:rPr>
-  </w:style>
-  <w:style w:styleId="Date" w:type="paragraph">
-    <w:name w:val="Date"/>
-    <w:basedOn w:val="Title"/>
-    <w:next w:val="BodyText"/>
-    <w:qFormat/>
-    <w:pPr>
-      <w:keepNext/>
-      <w:keepLines/>
-    </w:pPr>
-    <w:rPr>
-      <w:sz w:val="24"/>
-      <w:szCs w:val="24"/>
-    </w:rPr>
-  </w:style>
-  <w:style w:customStyle="1" w:styleId="AbstractTitle" w:type="paragraph">
-    <w:name w:val="Abstract Title"/>
-    <w:basedOn w:val="Normal"/>
-    <w:next w:val="Abstract"/>
-    <w:qFormat/>
-    <w:pPr>
-      <w:keepNext/>
-      <w:keepLines/>
-      <w:spacing w:after="0" w:before="300"/>
-      <w:jc w:val="center"/>
-    </w:pPr>
-    <w:rPr>
-      <w:b/>
-      <w:sz w:val="20"/>
-      <w:szCs w:val="20"/>
-    </w:rPr>
-  </w:style>
-  <w:style w:customStyle="1" w:styleId="Abstract" w:type="paragraph">
-    <w:name w:val="Abstract"/>
-    <w:basedOn w:val="Normal"/>
-    <w:next w:val="BodyText"/>
-    <w:qFormat/>
-    <w:pPr>
-      <w:keepNext/>
-      <w:keepLines/>
-      <w:spacing w:after="300" w:before="100"/>
-    </w:pPr>
-    <w:rPr>
-      <w:sz w:val="20"/>
-      <w:szCs w:val="20"/>
-    </w:rPr>
-  </w:style>
-  <w:style w:styleId="Bibliography" w:type="paragraph">
-    <w:name w:val="Bibliography"/>
-    <w:basedOn w:val="Normal"/>
-    <w:next w:val="Bibliography"/>
-    <w:qFormat/>
-    <w:pPr/>
-    <w:rPr/>
   </w:style>
   <w:style w:styleId="Heading1" w:type="paragraph">
     <w:name w:val="heading 1"/>
@@ -11102,13 +11372,15 @@
     <w:pPr>
       <w:keepNext/>
       <w:keepLines/>
-      <w:spacing w:after="80" w:before="360"/>
+      <w:spacing w:after="0" w:before="480" w:line="276" w:lineRule="auto"/>
+      <w:ind w:firstLine="0"/>
       <w:outlineLvl w:val="0"/>
     </w:pPr>
     <w:rPr>
       <w:rFonts w:asciiTheme="majorHAnsi" w:cstheme="majorBidi" w:eastAsiaTheme="majorEastAsia" w:hAnsiTheme="majorHAnsi"/>
-      <w:color w:themeColor="accent1" w:themeShade="BF" w:val="0F4761"/>
-      <w:sz w:val="40"/>
+      <w:b/>
+      <w:color w:val="365F91"/>
+      <w:sz w:val="32"/>
       <w:szCs w:val="40"/>
     </w:rPr>
   </w:style>
@@ -11125,13 +11397,15 @@
     <w:pPr>
       <w:keepNext/>
       <w:keepLines/>
-      <w:spacing w:after="80" w:before="160"/>
+      <w:spacing w:after="0" w:before="200" w:line="276" w:lineRule="auto"/>
+      <w:ind w:firstLine="0"/>
       <w:outlineLvl w:val="1"/>
     </w:pPr>
     <w:rPr>
       <w:rFonts w:asciiTheme="majorHAnsi" w:cstheme="majorBidi" w:eastAsiaTheme="majorEastAsia" w:hAnsiTheme="majorHAnsi"/>
-      <w:color w:themeColor="accent1" w:themeShade="BF" w:val="0F4761"/>
-      <w:sz w:val="32"/>
+      <w:b/>
+      <w:color w:val="4F81BD"/>
+      <w:sz w:val="28"/>
       <w:szCs w:val="32"/>
     </w:rPr>
   </w:style>
@@ -11148,13 +11422,14 @@
     <w:pPr>
       <w:keepNext/>
       <w:keepLines/>
-      <w:spacing w:after="80" w:before="160"/>
+      <w:spacing w:after="0" w:before="200" w:line="276" w:lineRule="auto"/>
+      <w:ind w:firstLine="0"/>
       <w:outlineLvl w:val="2"/>
     </w:pPr>
     <w:rPr>
       <w:rFonts w:cstheme="majorBidi" w:eastAsiaTheme="majorEastAsia"/>
-      <w:color w:themeColor="accent1" w:themeShade="BF" w:val="0F4761"/>
-      <w:sz w:val="28"/>
+      <w:b/>
+      <w:color w:val="4F81BD"/>
       <w:szCs w:val="28"/>
     </w:rPr>
   </w:style>
@@ -11290,6 +11565,189 @@
       <w:color w:themeColor="text1" w:themeTint="D8" w:val="272727"/>
     </w:rPr>
   </w:style>
+  <w:style w:default="1" w:styleId="DefaultParagraphFont" w:type="character">
+    <w:name w:val="Default Paragraph Font"/>
+    <w:uiPriority w:val="1"/>
+    <w:semiHidden/>
+    <w:unhideWhenUsed/>
+  </w:style>
+  <w:style w:default="1" w:styleId="TableNormal" w:type="table">
+    <w:name w:val="Normal Table"/>
+    <w:uiPriority w:val="99"/>
+    <w:semiHidden/>
+    <w:unhideWhenUsed/>
+    <w:tblPr>
+      <w:tblInd w:type="dxa" w:w="0"/>
+      <w:tblCellMar>
+        <w:top w:type="dxa" w:w="0"/>
+        <w:left w:type="dxa" w:w="108"/>
+        <w:bottom w:type="dxa" w:w="0"/>
+        <w:right w:type="dxa" w:w="108"/>
+      </w:tblCellMar>
+    </w:tblPr>
+  </w:style>
+  <w:style w:default="1" w:styleId="NoList" w:type="numbering">
+    <w:name w:val="No List"/>
+    <w:uiPriority w:val="99"/>
+    <w:semiHidden/>
+    <w:unhideWhenUsed/>
+  </w:style>
+  <w:style w:styleId="BodyText" w:type="paragraph">
+    <w:name w:val="Body Text"/>
+    <w:basedOn w:val="Normal"/>
+    <w:qFormat/>
+    <w:pPr>
+      <w:spacing w:before="180"/>
+    </w:pPr>
+  </w:style>
+  <w:style w:customStyle="1" w:styleId="FirstParagraph" w:type="paragraph">
+    <w:name w:val="First Paragraph"/>
+    <w:basedOn w:val="BodyText"/>
+    <w:next w:val="BodyText"/>
+    <w:qFormat/>
+  </w:style>
+  <w:style w:customStyle="1" w:styleId="Compact" w:type="paragraph">
+    <w:name w:val="Compact"/>
+    <w:basedOn w:val="BodyText"/>
+    <w:qFormat/>
+    <w:pPr>
+      <w:spacing w:before="36" w:line="276" w:lineRule="auto"/>
+      <w:ind w:firstLine="0"/>
+    </w:pPr>
+    <w:rPr>
+      <w:sz w:val="24"/>
+    </w:rPr>
+  </w:style>
+  <w:style w:styleId="Title" w:type="paragraph">
+    <w:name w:val="Title"/>
+    <w:basedOn w:val="Normal"/>
+    <w:next w:val="BodyText"/>
+    <w:link w:val="TitleChar"/>
+    <w:uiPriority w:val="10"/>
+    <w:qFormat/>
+    <w:rsid w:val="00A10FD9"/>
+    <w:pPr>
+      <w:spacing w:after="80" w:line="240" w:lineRule="auto"/>
+      <w:contextualSpacing/>
+      <w:jc w:val="center"/>
+    </w:pPr>
+    <w:rPr>
+      <w:rFonts w:asciiTheme="majorHAnsi" w:cstheme="majorBidi" w:eastAsiaTheme="majorEastAsia" w:hAnsiTheme="majorHAnsi"/>
+      <w:sz w:val="56"/>
+      <w:szCs w:val="56"/>
+    </w:rPr>
+  </w:style>
+  <w:style w:customStyle="1" w:styleId="TitleChar" w:type="character">
+    <w:name w:val="Title Char"/>
+    <w:basedOn w:val="DefaultParagraphFont"/>
+    <w:link w:val="Title"/>
+    <w:uiPriority w:val="10"/>
+    <w:rsid w:val="00A10FD9"/>
+    <w:rPr>
+      <w:rFonts w:asciiTheme="majorHAnsi" w:cstheme="majorBidi" w:eastAsiaTheme="majorEastAsia" w:hAnsiTheme="majorHAnsi"/>
+      <w:sz w:val="56"/>
+      <w:szCs w:val="56"/>
+    </w:rPr>
+  </w:style>
+  <w:style w:styleId="Subtitle" w:type="paragraph">
+    <w:name w:val="Subtitle"/>
+    <w:basedOn w:val="Title"/>
+    <w:next w:val="BodyText"/>
+    <w:link w:val="SubtitleChar"/>
+    <w:uiPriority w:val="11"/>
+    <w:qFormat/>
+    <w:rsid w:val="00A10FD9"/>
+    <w:pPr>
+      <w:numPr>
+        <w:ilvl w:val="1"/>
+      </w:numPr>
+      <w:ind w:firstLine="425"/>
+    </w:pPr>
+    <w:rPr>
+      <w:spacing w:val="15"/>
+      <w:sz w:val="28"/>
+      <w:szCs w:val="28"/>
+    </w:rPr>
+  </w:style>
+  <w:style w:customStyle="1" w:styleId="SubtitleChar" w:type="character">
+    <w:name w:val="Subtitle Char"/>
+    <w:basedOn w:val="DefaultParagraphFont"/>
+    <w:link w:val="Subtitle"/>
+    <w:uiPriority w:val="11"/>
+    <w:rsid w:val="00A10FD9"/>
+    <w:rPr>
+      <w:rFonts w:cstheme="majorBidi" w:eastAsiaTheme="majorEastAsia"/>
+      <w:color w:themeColor="text1" w:themeTint="A6" w:val="595959"/>
+      <w:spacing w:val="15"/>
+      <w:sz w:val="28"/>
+      <w:szCs w:val="28"/>
+    </w:rPr>
+  </w:style>
+  <w:style w:customStyle="1" w:styleId="Author" w:type="paragraph">
+    <w:name w:val="Author"/>
+    <w:basedOn w:val="Title"/>
+    <w:next w:val="BodyText"/>
+    <w:qFormat/>
+    <w:pPr>
+      <w:keepNext/>
+      <w:keepLines/>
+    </w:pPr>
+    <w:rPr>
+      <w:sz w:val="24"/>
+      <w:szCs w:val="24"/>
+    </w:rPr>
+  </w:style>
+  <w:style w:styleId="Date" w:type="paragraph">
+    <w:name w:val="Date"/>
+    <w:basedOn w:val="Title"/>
+    <w:next w:val="BodyText"/>
+    <w:qFormat/>
+    <w:pPr>
+      <w:keepNext/>
+      <w:keepLines/>
+    </w:pPr>
+    <w:rPr>
+      <w:sz w:val="24"/>
+      <w:szCs w:val="24"/>
+    </w:rPr>
+  </w:style>
+  <w:style w:customStyle="1" w:styleId="AbstractTitle" w:type="paragraph">
+    <w:name w:val="Abstract Title"/>
+    <w:basedOn w:val="Normal"/>
+    <w:next w:val="Abstract"/>
+    <w:qFormat/>
+    <w:pPr>
+      <w:keepNext/>
+      <w:keepLines/>
+      <w:spacing w:after="0" w:before="300"/>
+      <w:jc w:val="center"/>
+    </w:pPr>
+    <w:rPr>
+      <w:b/>
+      <w:sz w:val="20"/>
+      <w:szCs w:val="20"/>
+    </w:rPr>
+  </w:style>
+  <w:style w:customStyle="1" w:styleId="Abstract" w:type="paragraph">
+    <w:name w:val="Abstract"/>
+    <w:basedOn w:val="Normal"/>
+    <w:next w:val="BodyText"/>
+    <w:qFormat/>
+    <w:pPr>
+      <w:keepNext/>
+      <w:keepLines/>
+      <w:spacing w:after="300" w:before="100"/>
+    </w:pPr>
+    <w:rPr>
+      <w:sz w:val="20"/>
+      <w:szCs w:val="20"/>
+    </w:rPr>
+  </w:style>
+  <w:style w:styleId="Bibliography" w:type="paragraph">
+    <w:name w:val="Bibliography"/>
+    <w:basedOn w:val="Normal"/>
+    <w:qFormat/>
+  </w:style>
   <w:style w:customStyle="1" w:styleId="Heading1Char" w:type="character">
     <w:name w:val="Heading 1 Char"/>
     <w:basedOn w:val="DefaultParagraphFont"/>
@@ -11422,14 +11880,13 @@
     </w:pPr>
   </w:style>
   <w:style w:styleId="FootnoteText" w:type="paragraph">
-    <w:name w:val="Footnote Text"/>
+    <w:name w:val="footnote text"/>
     <w:basedOn w:val="Normal"/>
-    <w:next w:val="FootnoteText"/>
     <w:uiPriority w:val="9"/>
     <w:unhideWhenUsed/>
     <w:qFormat/>
   </w:style>
-  <w:style w:styleId="FootnoteBlockText" w:type="paragraph">
+  <w:style w:customStyle="1" w:styleId="FootnoteBlockText" w:type="paragraph">
     <w:name w:val="Footnote Block Text"/>
     <w:basedOn w:val="FootnoteText"/>
     <w:next w:val="FootnoteText"/>
@@ -11441,14 +11898,8 @@
       <w:ind w:firstLine="0" w:left="480" w:right="480"/>
     </w:pPr>
   </w:style>
-  <w:style w:default="1" w:styleId="DefaultParagraphFont" w:type="character">
-    <w:name w:val="Default Paragraph Font"/>
-    <w:semiHidden/>
-    <w:unhideWhenUsed/>
-  </w:style>
-  <w:style w:default="1" w:styleId="Table" w:type="table">
+  <w:style w:customStyle="1" w:styleId="Table" w:type="table">
     <w:name w:val="Table"/>
-    <w:basedOn w:val="TableNormal"/>
     <w:semiHidden/>
     <w:unhideWhenUsed/>
     <w:qFormat/>
@@ -11462,9 +11913,10 @@
       </w:tblCellMar>
     </w:tblPr>
     <w:tblStylePr w:type="firstRow">
+      <w:tblPr/>
       <w:tcPr>
         <w:tcBorders>
-          <w:bottom w:val="single"/>
+          <w:bottom w:color="auto" w:space="0" w:sz="0" w:val="single"/>
         </w:tcBorders>
         <w:vAlign w:val="bottom"/>
       </w:tcPr>
@@ -11488,12 +11940,9 @@
     <w:basedOn w:val="Normal"/>
   </w:style>
   <w:style w:styleId="Caption" w:type="paragraph">
-    <w:name w:val="Caption"/>
+    <w:name w:val="caption"/>
     <w:basedOn w:val="Normal"/>
-    <w:link w:val="BodyTextChar"/>
-    <w:pPr>
-      <w:spacing w:after="120" w:before="0"/>
-    </w:pPr>
+    <w:link w:val="CaptionChar"/>
     <w:rPr>
       <w:i/>
     </w:rPr>
@@ -11504,10 +11953,20 @@
     <w:pPr>
       <w:keepNext/>
     </w:pPr>
+    <w:rPr>
+      <w:b/>
+      <w:color w:val="000000"/>
+      <w:sz w:val="20"/>
+    </w:rPr>
   </w:style>
   <w:style w:customStyle="1" w:styleId="ImageCaption" w:type="paragraph">
     <w:name w:val="Image Caption"/>
     <w:basedOn w:val="Caption"/>
+    <w:rPr>
+      <w:b/>
+      <w:color w:val="000000"/>
+      <w:sz w:val="20"/>
+    </w:rPr>
   </w:style>
   <w:style w:customStyle="1" w:styleId="Figure" w:type="paragraph">
     <w:name w:val="Figure"/>
@@ -11520,14 +11979,15 @@
       <w:keepNext/>
     </w:pPr>
   </w:style>
-  <w:style w:customStyle="1" w:styleId="BodyTextChar" w:type="character">
-    <w:name w:val="Body Text Char"/>
+  <w:style w:customStyle="1" w:styleId="CaptionChar" w:type="character">
+    <w:name w:val="Caption Char"/>
     <w:basedOn w:val="DefaultParagraphFont"/>
-    <w:link w:val="BodyText"/>
+    <w:link w:val="Caption"/>
   </w:style>
   <w:style w:customStyle="1" w:styleId="VerbatimChar" w:type="character">
     <w:name w:val="Verbatim Char"/>
-    <w:basedOn w:val="BodyTextChar"/>
+    <w:basedOn w:val="CaptionChar"/>
+    <w:link w:val="SourceCode"/>
     <w:rPr>
       <w:rFonts w:ascii="Consolas" w:hAnsi="Consolas"/>
       <w:sz w:val="22"/>
@@ -11535,20 +11995,20 @@
   </w:style>
   <w:style w:customStyle="1" w:styleId="SectionNumber" w:type="character">
     <w:name w:val="Section Number"/>
-    <w:basedOn w:val="BodyTextChar"/>
+    <w:basedOn w:val="CaptionChar"/>
   </w:style>
   <w:style w:styleId="FootnoteReference" w:type="character">
-    <w:name w:val="Footnote Reference"/>
-    <w:basedOn w:val="BodyTextChar"/>
+    <w:name w:val="footnote reference"/>
+    <w:basedOn w:val="CaptionChar"/>
     <w:rPr>
       <w:vertAlign w:val="superscript"/>
     </w:rPr>
   </w:style>
   <w:style w:styleId="Hyperlink" w:type="character">
     <w:name w:val="Hyperlink"/>
-    <w:basedOn w:val="BodyTextChar"/>
+    <w:basedOn w:val="CaptionChar"/>
     <w:rPr>
-      <w:color w:themeColor="accent1" w:val="4F81BD"/>
+      <w:color w:themeColor="accent1" w:val="156082"/>
     </w:rPr>
   </w:style>
   <w:style w:styleId="TOCHeading" w:type="paragraph">
@@ -11563,245 +12023,320 @@
       <w:outlineLvl w:val="9"/>
     </w:pPr>
     <w:rPr>
-      <w:rFonts w:asciiTheme="majorHAnsi" w:cstheme="majorBidi" w:eastAsiaTheme="majorEastAsia" w:hAnsiTheme="majorHAnsi"/>
       <w:b w:val="0"/>
-      <w:bCs w:val="0"/>
-      <w:color w:themeColor="accent1" w:themeShade="BF" w:val="365F91"/>
+      <w:color w:themeColor="accent1" w:themeShade="BF" w:val="0F4761"/>
     </w:rPr>
   </w:style>
-  <w:style w:type="paragraph" w:customStyle="1" w:styleId="SourceCode">
+  <w:style w:customStyle="1" w:styleId="SourceCode" w:type="paragraph">
     <w:name w:val="Source Code"/>
     <w:basedOn w:val="Normal"/>
     <w:link w:val="VerbatimChar"/>
     <w:pPr>
-      <w:wordWrap w:val="off"/>
+      <w:wordWrap w:val="0"/>
     </w:pPr>
   </w:style>
-  <w:style w:type="character" w:customStyle="1" w:styleId="KeywordTok">
+  <w:style w:customStyle="1" w:styleId="KeywordTok" w:type="character">
     <w:name w:val="KeywordTok"/>
     <w:basedOn w:val="VerbatimChar"/>
     <w:rPr>
+      <w:rFonts w:ascii="Consolas" w:hAnsi="Consolas"/>
       <w:b/>
       <w:color w:val="007020"/>
+      <w:sz w:val="22"/>
     </w:rPr>
   </w:style>
-  <w:style w:type="character" w:customStyle="1" w:styleId="DataTypeTok">
+  <w:style w:customStyle="1" w:styleId="DataTypeTok" w:type="character">
     <w:name w:val="DataTypeTok"/>
     <w:basedOn w:val="VerbatimChar"/>
     <w:rPr>
+      <w:rFonts w:ascii="Consolas" w:hAnsi="Consolas"/>
       <w:color w:val="902000"/>
+      <w:sz w:val="22"/>
     </w:rPr>
   </w:style>
-  <w:style w:type="character" w:customStyle="1" w:styleId="DecValTok">
+  <w:style w:customStyle="1" w:styleId="DecValTok" w:type="character">
     <w:name w:val="DecValTok"/>
     <w:basedOn w:val="VerbatimChar"/>
     <w:rPr>
-      <w:color w:val="40a070"/>
+      <w:rFonts w:ascii="Consolas" w:hAnsi="Consolas"/>
+      <w:color w:val="40A070"/>
+      <w:sz w:val="22"/>
     </w:rPr>
   </w:style>
-  <w:style w:type="character" w:customStyle="1" w:styleId="BaseNTok">
+  <w:style w:customStyle="1" w:styleId="BaseNTok" w:type="character">
     <w:name w:val="BaseNTok"/>
     <w:basedOn w:val="VerbatimChar"/>
     <w:rPr>
-      <w:color w:val="40a070"/>
+      <w:rFonts w:ascii="Consolas" w:hAnsi="Consolas"/>
+      <w:color w:val="40A070"/>
+      <w:sz w:val="22"/>
     </w:rPr>
   </w:style>
-  <w:style w:type="character" w:customStyle="1" w:styleId="FloatTok">
+  <w:style w:customStyle="1" w:styleId="FloatTok" w:type="character">
     <w:name w:val="FloatTok"/>
     <w:basedOn w:val="VerbatimChar"/>
     <w:rPr>
-      <w:color w:val="40a070"/>
+      <w:rFonts w:ascii="Consolas" w:hAnsi="Consolas"/>
+      <w:color w:val="40A070"/>
+      <w:sz w:val="22"/>
     </w:rPr>
   </w:style>
-  <w:style w:type="character" w:customStyle="1" w:styleId="ConstantTok">
+  <w:style w:customStyle="1" w:styleId="ConstantTok" w:type="character">
     <w:name w:val="ConstantTok"/>
     <w:basedOn w:val="VerbatimChar"/>
     <w:rPr>
+      <w:rFonts w:ascii="Consolas" w:hAnsi="Consolas"/>
       <w:color w:val="880000"/>
+      <w:sz w:val="22"/>
     </w:rPr>
   </w:style>
-  <w:style w:type="character" w:customStyle="1" w:styleId="CharTok">
+  <w:style w:customStyle="1" w:styleId="CharTok" w:type="character">
     <w:name w:val="CharTok"/>
     <w:basedOn w:val="VerbatimChar"/>
     <w:rPr>
-      <w:color w:val="4070a0"/>
+      <w:rFonts w:ascii="Consolas" w:hAnsi="Consolas"/>
+      <w:color w:val="4070A0"/>
+      <w:sz w:val="22"/>
     </w:rPr>
   </w:style>
-  <w:style w:type="character" w:customStyle="1" w:styleId="SpecialCharTok">
+  <w:style w:customStyle="1" w:styleId="SpecialCharTok" w:type="character">
     <w:name w:val="SpecialCharTok"/>
     <w:basedOn w:val="VerbatimChar"/>
     <w:rPr>
-      <w:color w:val="4070a0"/>
+      <w:rFonts w:ascii="Consolas" w:hAnsi="Consolas"/>
+      <w:color w:val="4070A0"/>
+      <w:sz w:val="22"/>
     </w:rPr>
   </w:style>
-  <w:style w:type="character" w:customStyle="1" w:styleId="StringTok">
+  <w:style w:customStyle="1" w:styleId="StringTok" w:type="character">
     <w:name w:val="StringTok"/>
     <w:basedOn w:val="VerbatimChar"/>
     <w:rPr>
-      <w:color w:val="4070a0"/>
+      <w:rFonts w:ascii="Consolas" w:hAnsi="Consolas"/>
+      <w:color w:val="4070A0"/>
+      <w:sz w:val="22"/>
     </w:rPr>
   </w:style>
-  <w:style w:type="character" w:customStyle="1" w:styleId="VerbatimStringTok">
+  <w:style w:customStyle="1" w:styleId="VerbatimStringTok" w:type="character">
     <w:name w:val="VerbatimStringTok"/>
     <w:basedOn w:val="VerbatimChar"/>
     <w:rPr>
-      <w:color w:val="4070a0"/>
+      <w:rFonts w:ascii="Consolas" w:hAnsi="Consolas"/>
+      <w:color w:val="4070A0"/>
+      <w:sz w:val="22"/>
     </w:rPr>
   </w:style>
-  <w:style w:type="character" w:customStyle="1" w:styleId="SpecialStringTok">
+  <w:style w:customStyle="1" w:styleId="SpecialStringTok" w:type="character">
     <w:name w:val="SpecialStringTok"/>
     <w:basedOn w:val="VerbatimChar"/>
     <w:rPr>
-      <w:color w:val="bb6688"/>
+      <w:rFonts w:ascii="Consolas" w:hAnsi="Consolas"/>
+      <w:color w:val="BB6688"/>
+      <w:sz w:val="22"/>
     </w:rPr>
   </w:style>
-  <w:style w:type="character" w:customStyle="1" w:styleId="ImportTok">
+  <w:style w:customStyle="1" w:styleId="ImportTok" w:type="character">
     <w:name w:val="ImportTok"/>
     <w:basedOn w:val="VerbatimChar"/>
     <w:rPr>
+      <w:rFonts w:ascii="Consolas" w:hAnsi="Consolas"/>
       <w:b/>
       <w:color w:val="008000"/>
+      <w:sz w:val="22"/>
     </w:rPr>
   </w:style>
-  <w:style w:type="character" w:customStyle="1" w:styleId="CommentTok">
+  <w:style w:customStyle="1" w:styleId="CommentTok" w:type="character">
     <w:name w:val="CommentTok"/>
     <w:basedOn w:val="VerbatimChar"/>
     <w:rPr>
+      <w:rFonts w:ascii="Consolas" w:hAnsi="Consolas"/>
       <w:i/>
-      <w:color w:val="60a0b0"/>
+      <w:color w:val="60A0B0"/>
+      <w:sz w:val="22"/>
     </w:rPr>
   </w:style>
-  <w:style w:type="character" w:customStyle="1" w:styleId="DocumentationTok">
+  <w:style w:customStyle="1" w:styleId="DocumentationTok" w:type="character">
     <w:name w:val="DocumentationTok"/>
     <w:basedOn w:val="VerbatimChar"/>
     <w:rPr>
+      <w:rFonts w:ascii="Consolas" w:hAnsi="Consolas"/>
       <w:i/>
-      <w:color w:val="ba2121"/>
+      <w:color w:val="BA2121"/>
+      <w:sz w:val="22"/>
     </w:rPr>
   </w:style>
-  <w:style w:type="character" w:customStyle="1" w:styleId="AnnotationTok">
+  <w:style w:customStyle="1" w:styleId="AnnotationTok" w:type="character">
     <w:name w:val="AnnotationTok"/>
     <w:basedOn w:val="VerbatimChar"/>
     <w:rPr>
+      <w:rFonts w:ascii="Consolas" w:hAnsi="Consolas"/>
       <w:b/>
       <w:i/>
-      <w:color w:val="60a0b0"/>
+      <w:color w:val="60A0B0"/>
+      <w:sz w:val="22"/>
     </w:rPr>
   </w:style>
-  <w:style w:type="character" w:customStyle="1" w:styleId="CommentVarTok">
+  <w:style w:customStyle="1" w:styleId="CommentVarTok" w:type="character">
     <w:name w:val="CommentVarTok"/>
     <w:basedOn w:val="VerbatimChar"/>
     <w:rPr>
+      <w:rFonts w:ascii="Consolas" w:hAnsi="Consolas"/>
       <w:b/>
       <w:i/>
-      <w:color w:val="60a0b0"/>
+      <w:color w:val="60A0B0"/>
+      <w:sz w:val="22"/>
     </w:rPr>
   </w:style>
-  <w:style w:type="character" w:customStyle="1" w:styleId="OtherTok">
+  <w:style w:customStyle="1" w:styleId="OtherTok" w:type="character">
     <w:name w:val="OtherTok"/>
     <w:basedOn w:val="VerbatimChar"/>
     <w:rPr>
+      <w:rFonts w:ascii="Consolas" w:hAnsi="Consolas"/>
       <w:color w:val="007020"/>
+      <w:sz w:val="22"/>
     </w:rPr>
   </w:style>
-  <w:style w:type="character" w:customStyle="1" w:styleId="FunctionTok">
+  <w:style w:customStyle="1" w:styleId="FunctionTok" w:type="character">
     <w:name w:val="FunctionTok"/>
     <w:basedOn w:val="VerbatimChar"/>
     <w:rPr>
-      <w:color w:val="06287e"/>
+      <w:rFonts w:ascii="Consolas" w:hAnsi="Consolas"/>
+      <w:color w:val="06287E"/>
+      <w:sz w:val="22"/>
     </w:rPr>
   </w:style>
-  <w:style w:type="character" w:customStyle="1" w:styleId="VariableTok">
+  <w:style w:customStyle="1" w:styleId="VariableTok" w:type="character">
     <w:name w:val="VariableTok"/>
     <w:basedOn w:val="VerbatimChar"/>
     <w:rPr>
-      <w:color w:val="19177c"/>
+      <w:rFonts w:ascii="Consolas" w:hAnsi="Consolas"/>
+      <w:color w:val="19177C"/>
+      <w:sz w:val="22"/>
     </w:rPr>
   </w:style>
-  <w:style w:type="character" w:customStyle="1" w:styleId="ControlFlowTok">
+  <w:style w:customStyle="1" w:styleId="ControlFlowTok" w:type="character">
     <w:name w:val="ControlFlowTok"/>
     <w:basedOn w:val="VerbatimChar"/>
     <w:rPr>
+      <w:rFonts w:ascii="Consolas" w:hAnsi="Consolas"/>
       <w:b/>
       <w:color w:val="007020"/>
+      <w:sz w:val="22"/>
     </w:rPr>
   </w:style>
-  <w:style w:type="character" w:customStyle="1" w:styleId="OperatorTok">
+  <w:style w:customStyle="1" w:styleId="OperatorTok" w:type="character">
     <w:name w:val="OperatorTok"/>
     <w:basedOn w:val="VerbatimChar"/>
     <w:rPr>
+      <w:rFonts w:ascii="Consolas" w:hAnsi="Consolas"/>
       <w:color w:val="666666"/>
+      <w:sz w:val="22"/>
     </w:rPr>
   </w:style>
-  <w:style w:type="character" w:customStyle="1" w:styleId="BuiltInTok">
+  <w:style w:customStyle="1" w:styleId="BuiltInTok" w:type="character">
     <w:name w:val="BuiltInTok"/>
     <w:basedOn w:val="VerbatimChar"/>
     <w:rPr>
+      <w:rFonts w:ascii="Consolas" w:hAnsi="Consolas"/>
       <w:color w:val="008000"/>
+      <w:sz w:val="22"/>
     </w:rPr>
   </w:style>
-  <w:style w:type="character" w:customStyle="1" w:styleId="ExtensionTok">
+  <w:style w:customStyle="1" w:styleId="ExtensionTok" w:type="character">
     <w:name w:val="ExtensionTok"/>
     <w:basedOn w:val="VerbatimChar"/>
-    <w:rPr/>
+    <w:rPr>
+      <w:rFonts w:ascii="Consolas" w:hAnsi="Consolas"/>
+      <w:sz w:val="22"/>
+    </w:rPr>
   </w:style>
-  <w:style w:type="character" w:customStyle="1" w:styleId="PreprocessorTok">
+  <w:style w:customStyle="1" w:styleId="PreprocessorTok" w:type="character">
     <w:name w:val="PreprocessorTok"/>
     <w:basedOn w:val="VerbatimChar"/>
     <w:rPr>
-      <w:color w:val="bc7a00"/>
+      <w:rFonts w:ascii="Consolas" w:hAnsi="Consolas"/>
+      <w:color w:val="BC7A00"/>
+      <w:sz w:val="22"/>
     </w:rPr>
   </w:style>
-  <w:style w:type="character" w:customStyle="1" w:styleId="AttributeTok">
+  <w:style w:customStyle="1" w:styleId="AttributeTok" w:type="character">
     <w:name w:val="AttributeTok"/>
     <w:basedOn w:val="VerbatimChar"/>
     <w:rPr>
-      <w:color w:val="7d9029"/>
+      <w:rFonts w:ascii="Consolas" w:hAnsi="Consolas"/>
+      <w:color w:val="7D9029"/>
+      <w:sz w:val="22"/>
     </w:rPr>
   </w:style>
-  <w:style w:type="character" w:customStyle="1" w:styleId="RegionMarkerTok">
+  <w:style w:customStyle="1" w:styleId="RegionMarkerTok" w:type="character">
     <w:name w:val="RegionMarkerTok"/>
     <w:basedOn w:val="VerbatimChar"/>
-    <w:rPr/>
+    <w:rPr>
+      <w:rFonts w:ascii="Consolas" w:hAnsi="Consolas"/>
+      <w:sz w:val="22"/>
+    </w:rPr>
   </w:style>
-  <w:style w:type="character" w:customStyle="1" w:styleId="InformationTok">
+  <w:style w:customStyle="1" w:styleId="InformationTok" w:type="character">
     <w:name w:val="InformationTok"/>
     <w:basedOn w:val="VerbatimChar"/>
     <w:rPr>
+      <w:rFonts w:ascii="Consolas" w:hAnsi="Consolas"/>
       <w:b/>
       <w:i/>
-      <w:color w:val="60a0b0"/>
+      <w:color w:val="60A0B0"/>
+      <w:sz w:val="22"/>
     </w:rPr>
   </w:style>
-  <w:style w:type="character" w:customStyle="1" w:styleId="WarningTok">
+  <w:style w:customStyle="1" w:styleId="WarningTok" w:type="character">
     <w:name w:val="WarningTok"/>
     <w:basedOn w:val="VerbatimChar"/>
     <w:rPr>
+      <w:rFonts w:ascii="Consolas" w:hAnsi="Consolas"/>
       <w:b/>
       <w:i/>
-      <w:color w:val="60a0b0"/>
+      <w:color w:val="60A0B0"/>
+      <w:sz w:val="22"/>
     </w:rPr>
   </w:style>
-  <w:style w:type="character" w:customStyle="1" w:styleId="AlertTok">
+  <w:style w:customStyle="1" w:styleId="AlertTok" w:type="character">
     <w:name w:val="AlertTok"/>
     <w:basedOn w:val="VerbatimChar"/>
     <w:rPr>
+      <w:rFonts w:ascii="Consolas" w:hAnsi="Consolas"/>
       <w:b/>
-      <w:color w:val="ff0000"/>
+      <w:color w:val="FF0000"/>
+      <w:sz w:val="22"/>
     </w:rPr>
   </w:style>
-  <w:style w:type="character" w:customStyle="1" w:styleId="ErrorTok">
+  <w:style w:customStyle="1" w:styleId="ErrorTok" w:type="character">
     <w:name w:val="ErrorTok"/>
     <w:basedOn w:val="VerbatimChar"/>
     <w:rPr>
+      <w:rFonts w:ascii="Consolas" w:hAnsi="Consolas"/>
       <w:b/>
-      <w:color w:val="ff0000"/>
+      <w:color w:val="FF0000"/>
+      <w:sz w:val="22"/>
     </w:rPr>
   </w:style>
-  <w:style w:type="character" w:customStyle="1" w:styleId="NormalTok">
+  <w:style w:customStyle="1" w:styleId="NormalTok" w:type="character">
     <w:name w:val="NormalTok"/>
     <w:basedOn w:val="VerbatimChar"/>
-    <w:rPr/>
+    <w:rPr>
+      <w:rFonts w:ascii="Consolas" w:hAnsi="Consolas"/>
+      <w:sz w:val="22"/>
+    </w:rPr>
+  </w:style>
+  <w:style w:customStyle="1" w:styleId="ReferenceFront" w:type="paragraph">
+    <w:name w:val="Reference Front"/>
+    <w:basedOn w:val="Normal"/>
+  </w:style>
+  <w:style w:customStyle="1" w:styleId="ReferenceTOC1" w:type="paragraph">
+    <w:name w:val="Reference TOC 1"/>
+    <w:basedOn w:val="Normal"/>
+  </w:style>
+  <w:style w:customStyle="1" w:styleId="ReferenceTOC2" w:type="paragraph">
+    <w:name w:val="Reference TOC 2"/>
+    <w:basedOn w:val="Normal"/>
   </w:style>
 </w:styles>
 </file>

</xml_diff>